<commit_message>
subiendo las historias de usurio del sprint 2
</commit_message>
<xml_diff>
--- a/docs/sprint 2/sprint 2.docx
+++ b/docs/sprint 2/sprint 2.docx
@@ -1,6 +1,6 @@
 
 <file path=word/document.xml><?xml version="1.0" encoding="utf-8"?>
-<w:document xmlns:wpc="http://schemas.microsoft.com/office/word/2010/wordprocessingCanvas" xmlns:cx="http://schemas.microsoft.com/office/drawing/2014/chartex" xmlns:cx1="http://schemas.microsoft.com/office/drawing/2015/9/8/chartex" xmlns:cx2="http://schemas.microsoft.com/office/drawing/2015/10/21/chartex" xmlns:cx3="http://schemas.microsoft.com/office/drawing/2016/5/9/chartex" xmlns:cx4="http://schemas.microsoft.com/office/drawing/2016/5/10/chartex" xmlns:cx5="http://schemas.microsoft.com/office/drawing/2016/5/11/chartex" xmlns:cx6="http://schemas.microsoft.com/office/drawing/2016/5/12/chartex" xmlns:cx7="http://schemas.microsoft.com/office/drawing/2016/5/13/chartex" xmlns:cx8="http://schemas.microsoft.com/office/drawing/2016/5/14/chartex" xmlns:mc="http://schemas.openxmlformats.org/markup-compatibility/2006" xmlns:aink="http://schemas.microsoft.com/office/drawing/2016/ink" xmlns:am3d="http://schemas.microsoft.com/office/drawing/2017/model3d" xmlns:o="urn:schemas-microsoft-com:office:office" xmlns:r="http://schemas.openxmlformats.org/officeDocument/2006/relationships" xmlns:m="http://schemas.openxmlformats.org/officeDocument/2006/math" xmlns:v="urn:schemas-microsoft-com:vml" xmlns:wp14="http://schemas.microsoft.com/office/word/2010/wordprocessingDrawing" xmlns:wp="http://schemas.openxmlformats.org/drawingml/2006/wordprocessingDrawing" xmlns:w10="urn:schemas-microsoft-com:office:word" xmlns:w="http://schemas.openxmlformats.org/wordprocessingml/2006/main" xmlns:w14="http://schemas.microsoft.com/office/word/2010/wordml" xmlns:w15="http://schemas.microsoft.com/office/word/2012/wordml" xmlns:w16cex="http://schemas.microsoft.com/office/word/2018/wordml/cex" xmlns:w16cid="http://schemas.microsoft.com/office/word/2016/wordml/cid" xmlns:w16="http://schemas.microsoft.com/office/word/2018/wordml" xmlns:w16sdtdh="http://schemas.microsoft.com/office/word/2020/wordml/sdtdatahash" xmlns:w16se="http://schemas.microsoft.com/office/word/2015/wordml/symex" xmlns:wpg="http://schemas.microsoft.com/office/word/2010/wordprocessingGroup" xmlns:wpi="http://schemas.microsoft.com/office/word/2010/wordprocessingInk" xmlns:wne="http://schemas.microsoft.com/office/word/2006/wordml" xmlns:wps="http://schemas.microsoft.com/office/word/2010/wordprocessingShape" mc:Ignorable="w14 w15 w16se w16cid w16 w16cex w16sdtdh wp14">
+<w:document xmlns:wpc="http://schemas.microsoft.com/office/word/2010/wordprocessingCanvas" xmlns:cx="http://schemas.microsoft.com/office/drawing/2014/chartex" xmlns:cx1="http://schemas.microsoft.com/office/drawing/2015/9/8/chartex" xmlns:cx2="http://schemas.microsoft.com/office/drawing/2015/10/21/chartex" xmlns:cx3="http://schemas.microsoft.com/office/drawing/2016/5/9/chartex" xmlns:cx4="http://schemas.microsoft.com/office/drawing/2016/5/10/chartex" xmlns:cx5="http://schemas.microsoft.com/office/drawing/2016/5/11/chartex" xmlns:cx6="http://schemas.microsoft.com/office/drawing/2016/5/12/chartex" xmlns:cx7="http://schemas.microsoft.com/office/drawing/2016/5/13/chartex" xmlns:cx8="http://schemas.microsoft.com/office/drawing/2016/5/14/chartex" xmlns:mc="http://schemas.openxmlformats.org/markup-compatibility/2006" xmlns:aink="http://schemas.microsoft.com/office/drawing/2016/ink" xmlns:am3d="http://schemas.microsoft.com/office/drawing/2017/model3d" xmlns:o="urn:schemas-microsoft-com:office:office" xmlns:r="http://schemas.openxmlformats.org/officeDocument/2006/relationships" xmlns:m="http://schemas.openxmlformats.org/officeDocument/2006/math" xmlns:v="urn:schemas-microsoft-com:vml" xmlns:wp14="http://schemas.microsoft.com/office/word/2010/wordprocessingDrawing" xmlns:wp="http://schemas.openxmlformats.org/drawingml/2006/wordprocessingDrawing" xmlns:w10="urn:schemas-microsoft-com:office:word" xmlns:w="http://schemas.openxmlformats.org/wordprocessingml/2006/main" xmlns:w14="http://schemas.microsoft.com/office/word/2010/wordml" xmlns:w15="http://schemas.microsoft.com/office/word/2012/wordml" xmlns:w16cid="http://schemas.microsoft.com/office/word/2016/wordml/cid" xmlns:w16se="http://schemas.microsoft.com/office/word/2015/wordml/symex" xmlns:wpg="http://schemas.microsoft.com/office/word/2010/wordprocessingGroup" xmlns:wpi="http://schemas.microsoft.com/office/word/2010/wordprocessingInk" xmlns:wne="http://schemas.microsoft.com/office/word/2006/wordml" xmlns:wps="http://schemas.microsoft.com/office/word/2010/wordprocessingShape" mc:Ignorable="w14 w15 w16se w16cid wp14">
   <w:body>
     <w:p>
       <w:pPr>
@@ -82,7 +82,7 @@
               </wp:anchor>
             </w:drawing>
           </mc:Choice>
-          <mc:Fallback xmlns:oel="http://schemas.microsoft.com/office/2019/extlst">
+          <mc:Fallback xmlns:oel="http://schemas.microsoft.com/office/2019/extlst" xmlns:w16sdtdh="http://schemas.microsoft.com/office/word/2020/wordml/sdtdatahash" xmlns:w16="http://schemas.microsoft.com/office/word/2018/wordml" xmlns:w16cex="http://schemas.microsoft.com/office/word/2018/wordml/cex">
             <w:pict>
               <v:rect w14:anchorId="2D05ECE6" id="Rectángulo 3" o:spid="_x0000_s1026" alt="rectángulo blanco para texto en portada" style="position:absolute;margin-left:-15.95pt;margin-top:73.85pt;width:310.15pt;height:681.65pt;z-index:-251656192;visibility:visible;mso-wrap-style:square;mso-width-percent:0;mso-height-percent:0;mso-wrap-distance-left:9pt;mso-wrap-distance-top:0;mso-wrap-distance-right:9pt;mso-wrap-distance-bottom:0;mso-position-horizontal:absolute;mso-position-horizontal-relative:text;mso-position-vertical:absolute;mso-position-vertical-relative:page;mso-width-percent:0;mso-height-percent:0;mso-width-relative:margin;mso-height-relative:margin;v-text-anchor:middle" o:gfxdata="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" fillcolor="white [3212]" stroked="f" strokeweight="2pt">
                 <w10:wrap anchory="page"/>
@@ -436,7 +436,7 @@
                     </wp:inline>
                   </w:drawing>
                 </mc:Choice>
-                <mc:Fallback xmlns:oel="http://schemas.microsoft.com/office/2019/extlst">
+                <mc:Fallback xmlns:oel="http://schemas.microsoft.com/office/2019/extlst" xmlns:w16sdtdh="http://schemas.microsoft.com/office/word/2020/wordml/sdtdatahash" xmlns:w16="http://schemas.microsoft.com/office/word/2018/wordml" xmlns:w16cex="http://schemas.microsoft.com/office/word/2018/wordml/cex">
                   <w:pict>
                     <v:line w14:anchorId="3C7809CC" id="Conector recto 5" o:spid="_x0000_s1026" alt="divisor de texto" style="visibility:visible;mso-wrap-style:square;mso-left-percent:-10001;mso-top-percent:-10001;mso-position-horizontal:absolute;mso-position-horizontal-relative:char;mso-position-vertical:absolute;mso-position-vertical-relative:line;mso-left-percent:-10001;mso-top-percent:-10001" from="0,0" to="109.5pt,0" o:gfxdata="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" strokecolor="#082a75 [3215]" strokeweight="3pt">
                       <w10:anchorlock/>
@@ -496,7 +496,6 @@
               </w:placeholder>
               <w15:appearance w15:val="hidden"/>
             </w:sdtPr>
-            <w:sdtEndPr/>
             <w:sdtContent>
               <w:p>
                 <w:pPr>
@@ -538,7 +537,7 @@
                     <w:noProof/>
                     <w:lang w:bidi="es-ES"/>
                   </w:rPr>
-                  <w:t>30 abril</w:t>
+                  <w:t>6 mayo</w:t>
                 </w:r>
                 <w:r>
                   <w:rPr>
@@ -614,7 +613,7 @@
                     </wp:inline>
                   </w:drawing>
                 </mc:Choice>
-                <mc:Fallback xmlns:oel="http://schemas.microsoft.com/office/2019/extlst">
+                <mc:Fallback xmlns:oel="http://schemas.microsoft.com/office/2019/extlst" xmlns:w16sdtdh="http://schemas.microsoft.com/office/word/2020/wordml/sdtdatahash" xmlns:w16="http://schemas.microsoft.com/office/word/2018/wordml" xmlns:w16cex="http://schemas.microsoft.com/office/word/2018/wordml/cex">
                   <w:pict>
                     <v:line w14:anchorId="2EAC2734" id="Conector recto 6" o:spid="_x0000_s1026" alt="divisor de texto" style="visibility:visible;mso-wrap-style:square;mso-left-percent:-10001;mso-top-percent:-10001;mso-position-horizontal:absolute;mso-position-horizontal-relative:char;mso-position-vertical:absolute;mso-position-vertical-relative:line;mso-left-percent:-10001;mso-top-percent:-10001" from="0,0" to="117.65pt,0" o:gfxdata="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" strokecolor="#082a75 [3215]" strokeweight="3pt">
                       <w10:anchorlock/>
@@ -861,7 +860,7 @@
               </wp:anchor>
             </w:drawing>
           </mc:Choice>
-          <mc:Fallback>
+          <mc:Fallback xmlns:w16sdtdh="http://schemas.microsoft.com/office/word/2020/wordml/sdtdatahash" xmlns:w16="http://schemas.microsoft.com/office/word/2018/wordml" xmlns:w16cex="http://schemas.microsoft.com/office/word/2018/wordml/cex">
             <w:pict>
               <v:rect w14:anchorId="65894E13" id="Rectángulo 2" o:spid="_x0000_s1026" alt="rectángulo de color" style="position:absolute;margin-left:-58.7pt;margin-top:525pt;width:611.1pt;height:316.5pt;z-index:-251657216;visibility:visible;mso-wrap-style:square;mso-height-percent:0;mso-wrap-distance-left:9pt;mso-wrap-distance-top:0;mso-wrap-distance-right:9pt;mso-wrap-distance-bottom:0;mso-position-horizontal:absolute;mso-position-horizontal-relative:text;mso-position-vertical:absolute;mso-position-vertical-relative:page;mso-height-percent:0;mso-height-relative:margin;v-text-anchor:middle" o:gfxdata="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" fillcolor="#34aba2 [3206]" stroked="f" strokeweight="2pt">
                 <w10:wrap anchory="page"/>
@@ -2370,7 +2369,35 @@
         <w:rPr>
           <w:b w:val="0"/>
         </w:rPr>
-        <w:t xml:space="preserve"> Nathalia Mejia Buitrago.</w:t>
+        <w:t xml:space="preserve"> </w:t>
+      </w:r>
+      <w:proofErr w:type="spellStart"/>
+      <w:r>
+        <w:rPr>
+          <w:b w:val="0"/>
+        </w:rPr>
+        <w:t>Nathalia</w:t>
+      </w:r>
+      <w:proofErr w:type="spellEnd"/>
+      <w:r>
+        <w:rPr>
+          <w:b w:val="0"/>
+        </w:rPr>
+        <w:t xml:space="preserve"> </w:t>
+      </w:r>
+      <w:proofErr w:type="spellStart"/>
+      <w:r>
+        <w:rPr>
+          <w:b w:val="0"/>
+        </w:rPr>
+        <w:t>Mejia</w:t>
+      </w:r>
+      <w:proofErr w:type="spellEnd"/>
+      <w:r>
+        <w:rPr>
+          <w:b w:val="0"/>
+        </w:rPr>
+        <w:t xml:space="preserve"> Buitrago.</w:t>
       </w:r>
     </w:p>
     <w:p>
@@ -2424,7 +2451,35 @@
         <w:rPr>
           <w:b w:val="0"/>
         </w:rPr>
-        <w:t xml:space="preserve"> Nathalia Mejia Buitrago.</w:t>
+        <w:t xml:space="preserve"> </w:t>
+      </w:r>
+      <w:proofErr w:type="spellStart"/>
+      <w:r>
+        <w:rPr>
+          <w:b w:val="0"/>
+        </w:rPr>
+        <w:t>Nathalia</w:t>
+      </w:r>
+      <w:proofErr w:type="spellEnd"/>
+      <w:r>
+        <w:rPr>
+          <w:b w:val="0"/>
+        </w:rPr>
+        <w:t xml:space="preserve"> </w:t>
+      </w:r>
+      <w:proofErr w:type="spellStart"/>
+      <w:r>
+        <w:rPr>
+          <w:b w:val="0"/>
+        </w:rPr>
+        <w:t>Mejia</w:t>
+      </w:r>
+      <w:proofErr w:type="spellEnd"/>
+      <w:r>
+        <w:rPr>
+          <w:b w:val="0"/>
+        </w:rPr>
+        <w:t xml:space="preserve"> Buitrago.</w:t>
       </w:r>
     </w:p>
     <w:p>
@@ -2461,7 +2516,35 @@
         <w:rPr>
           <w:b w:val="0"/>
         </w:rPr>
-        <w:t xml:space="preserve"> Nathalia Mejia Buitrago - Isaura Alexandra Banguera Ruiz.</w:t>
+        <w:t xml:space="preserve"> </w:t>
+      </w:r>
+      <w:proofErr w:type="spellStart"/>
+      <w:r>
+        <w:rPr>
+          <w:b w:val="0"/>
+        </w:rPr>
+        <w:t>Nathalia</w:t>
+      </w:r>
+      <w:proofErr w:type="spellEnd"/>
+      <w:r>
+        <w:rPr>
+          <w:b w:val="0"/>
+        </w:rPr>
+        <w:t xml:space="preserve"> </w:t>
+      </w:r>
+      <w:proofErr w:type="spellStart"/>
+      <w:r>
+        <w:rPr>
+          <w:b w:val="0"/>
+        </w:rPr>
+        <w:t>Mejia</w:t>
+      </w:r>
+      <w:proofErr w:type="spellEnd"/>
+      <w:r>
+        <w:rPr>
+          <w:b w:val="0"/>
+        </w:rPr>
+        <w:t xml:space="preserve"> Buitrago - Isaura Alexandra Banguera Ruiz.</w:t>
       </w:r>
     </w:p>
     <w:p>
@@ -2503,11 +2586,47 @@
         </w:rPr>
         <w:t xml:space="preserve">: </w:t>
       </w:r>
+      <w:proofErr w:type="spellStart"/>
       <w:r>
         <w:rPr>
           <w:b w:val="0"/>
         </w:rPr>
-        <w:t>Nathalia Mejia Buitrago  - Isaura Alexandra Banguera Rui</w:t>
+        <w:t>Nathalia</w:t>
+      </w:r>
+      <w:proofErr w:type="spellEnd"/>
+      <w:r>
+        <w:rPr>
+          <w:b w:val="0"/>
+        </w:rPr>
+        <w:t xml:space="preserve"> </w:t>
+      </w:r>
+      <w:proofErr w:type="spellStart"/>
+      <w:r>
+        <w:rPr>
+          <w:b w:val="0"/>
+        </w:rPr>
+        <w:t>Mejia</w:t>
+      </w:r>
+      <w:proofErr w:type="spellEnd"/>
+      <w:r>
+        <w:rPr>
+          <w:b w:val="0"/>
+        </w:rPr>
+        <w:t xml:space="preserve"> </w:t>
+      </w:r>
+      <w:proofErr w:type="gramStart"/>
+      <w:r>
+        <w:rPr>
+          <w:b w:val="0"/>
+        </w:rPr>
+        <w:t>Buitrago  -</w:t>
+      </w:r>
+      <w:proofErr w:type="gramEnd"/>
+      <w:r>
+        <w:rPr>
+          <w:b w:val="0"/>
+        </w:rPr>
+        <w:t xml:space="preserve"> Isaura Alexandra Banguera Rui</w:t>
       </w:r>
     </w:p>
     <w:p>
@@ -5098,12 +5217,12 @@
         <w:tblLook w:val="04A0" w:firstRow="1" w:lastRow="0" w:firstColumn="1" w:lastColumn="0" w:noHBand="0" w:noVBand="1"/>
       </w:tblPr>
       <w:tblGrid>
-        <w:gridCol w:w="1200"/>
-        <w:gridCol w:w="1200"/>
-        <w:gridCol w:w="1200"/>
-        <w:gridCol w:w="1200"/>
-        <w:gridCol w:w="1200"/>
-        <w:gridCol w:w="1200"/>
+        <w:gridCol w:w="1670"/>
+        <w:gridCol w:w="1670"/>
+        <w:gridCol w:w="1671"/>
+        <w:gridCol w:w="1671"/>
+        <w:gridCol w:w="1671"/>
+        <w:gridCol w:w="1671"/>
       </w:tblGrid>
       <w:tr>
         <w:trPr>
@@ -6188,6 +6307,279 @@
               </w:rPr>
               <w:t> </w:t>
             </w:r>
+            <w:r>
+              <w:rPr>
+                <w:rFonts w:ascii="Calibri" w:eastAsia="Times New Roman" w:hAnsi="Calibri" w:cs="Calibri"/>
+                <w:b w:val="0"/>
+                <w:color w:val="000000"/>
+                <w:sz w:val="22"/>
+                <w:lang w:val="es-CO" w:eastAsia="es-CO"/>
+              </w:rPr>
+              <w:t>1.</w:t>
+            </w:r>
+            <w:r>
+              <w:rPr>
+                <w:rFonts w:ascii="Calibri" w:eastAsia="Times New Roman" w:hAnsi="Calibri" w:cs="Calibri"/>
+                <w:b w:val="0"/>
+                <w:color w:val="000000"/>
+                <w:sz w:val="22"/>
+                <w:lang w:val="es-CO" w:eastAsia="es-CO"/>
+              </w:rPr>
+              <w:t>acceso al sistema como empleado</w:t>
+            </w:r>
+          </w:p>
+          <w:p>
+            <w:pPr>
+              <w:spacing w:line="240" w:lineRule="auto"/>
+              <w:jc w:val="center"/>
+              <w:rPr>
+                <w:rFonts w:ascii="Calibri" w:eastAsia="Times New Roman" w:hAnsi="Calibri" w:cs="Calibri"/>
+                <w:b w:val="0"/>
+                <w:color w:val="000000"/>
+                <w:sz w:val="22"/>
+                <w:lang w:val="es-CO" w:eastAsia="es-CO"/>
+              </w:rPr>
+            </w:pPr>
+            <w:r>
+              <w:rPr>
+                <w:rFonts w:ascii="Calibri" w:eastAsia="Times New Roman" w:hAnsi="Calibri" w:cs="Calibri"/>
+                <w:b w:val="0"/>
+                <w:noProof/>
+                <w:color w:val="000000"/>
+                <w:sz w:val="22"/>
+                <w:lang w:val="es-CO" w:eastAsia="es-CO"/>
+              </w:rPr>
+              <w:drawing>
+                <wp:inline distT="0" distB="0" distL="0" distR="0" wp14:anchorId="29F18991" wp14:editId="5C8E3B92">
+                  <wp:extent cx="6087325" cy="4258269"/>
+                  <wp:effectExtent l="0" t="0" r="8890" b="9525"/>
+                  <wp:docPr id="7" name="Imagen 7"/>
+                  <wp:cNvGraphicFramePr>
+                    <a:graphicFrameLocks xmlns:a="http://schemas.openxmlformats.org/drawingml/2006/main" noChangeAspect="1"/>
+                  </wp:cNvGraphicFramePr>
+                  <a:graphic xmlns:a="http://schemas.openxmlformats.org/drawingml/2006/main">
+                    <a:graphicData uri="http://schemas.openxmlformats.org/drawingml/2006/picture">
+                      <pic:pic xmlns:pic="http://schemas.openxmlformats.org/drawingml/2006/picture">
+                        <pic:nvPicPr>
+                          <pic:cNvPr id="7" name="acceso al sistema como empleado.png"/>
+                          <pic:cNvPicPr/>
+                        </pic:nvPicPr>
+                        <pic:blipFill>
+                          <a:blip r:embed="rId14">
+                            <a:extLst>
+                              <a:ext uri="{28A0092B-C50C-407E-A947-70E740481C1C}">
+                                <a14:useLocalDpi xmlns:a14="http://schemas.microsoft.com/office/drawing/2010/main" val="0"/>
+                              </a:ext>
+                            </a:extLst>
+                          </a:blip>
+                          <a:stretch>
+                            <a:fillRect/>
+                          </a:stretch>
+                        </pic:blipFill>
+                        <pic:spPr>
+                          <a:xfrm>
+                            <a:off x="0" y="0"/>
+                            <a:ext cx="6087325" cy="4258269"/>
+                          </a:xfrm>
+                          <a:prstGeom prst="rect">
+                            <a:avLst/>
+                          </a:prstGeom>
+                        </pic:spPr>
+                      </pic:pic>
+                    </a:graphicData>
+                  </a:graphic>
+                </wp:inline>
+              </w:drawing>
+            </w:r>
+          </w:p>
+          <w:p>
+            <w:pPr>
+              <w:spacing w:line="240" w:lineRule="auto"/>
+              <w:jc w:val="center"/>
+              <w:rPr>
+                <w:rFonts w:ascii="Calibri" w:eastAsia="Times New Roman" w:hAnsi="Calibri" w:cs="Calibri"/>
+                <w:b w:val="0"/>
+                <w:color w:val="000000"/>
+                <w:sz w:val="22"/>
+                <w:lang w:val="es-CO" w:eastAsia="es-CO"/>
+              </w:rPr>
+            </w:pPr>
+            <w:r>
+              <w:rPr>
+                <w:rFonts w:ascii="Calibri" w:eastAsia="Times New Roman" w:hAnsi="Calibri" w:cs="Calibri"/>
+                <w:b w:val="0"/>
+                <w:color w:val="000000"/>
+                <w:sz w:val="22"/>
+                <w:lang w:val="es-CO" w:eastAsia="es-CO"/>
+              </w:rPr>
+              <w:t>2.registro de compra por el empleado</w:t>
+            </w:r>
+          </w:p>
+          <w:p>
+            <w:pPr>
+              <w:spacing w:line="240" w:lineRule="auto"/>
+              <w:jc w:val="center"/>
+              <w:rPr>
+                <w:rFonts w:ascii="Calibri" w:eastAsia="Times New Roman" w:hAnsi="Calibri" w:cs="Calibri"/>
+                <w:b w:val="0"/>
+                <w:color w:val="000000"/>
+                <w:sz w:val="22"/>
+                <w:lang w:val="es-CO" w:eastAsia="es-CO"/>
+              </w:rPr>
+            </w:pPr>
+            <w:r>
+              <w:rPr>
+                <w:rFonts w:ascii="Calibri" w:eastAsia="Times New Roman" w:hAnsi="Calibri" w:cs="Calibri"/>
+                <w:b w:val="0"/>
+                <w:noProof/>
+                <w:color w:val="000000"/>
+                <w:sz w:val="22"/>
+                <w:lang w:val="es-CO" w:eastAsia="es-CO"/>
+              </w:rPr>
+              <w:lastRenderedPageBreak/>
+              <w:drawing>
+                <wp:inline distT="0" distB="0" distL="0" distR="0" wp14:anchorId="574EB8D0" wp14:editId="0CFA0566">
+                  <wp:extent cx="6371590" cy="4489450"/>
+                  <wp:effectExtent l="0" t="0" r="0" b="6350"/>
+                  <wp:docPr id="9" name="Imagen 9"/>
+                  <wp:cNvGraphicFramePr>
+                    <a:graphicFrameLocks xmlns:a="http://schemas.openxmlformats.org/drawingml/2006/main" noChangeAspect="1"/>
+                  </wp:cNvGraphicFramePr>
+                  <a:graphic xmlns:a="http://schemas.openxmlformats.org/drawingml/2006/main">
+                    <a:graphicData uri="http://schemas.openxmlformats.org/drawingml/2006/picture">
+                      <pic:pic xmlns:pic="http://schemas.openxmlformats.org/drawingml/2006/picture">
+                        <pic:nvPicPr>
+                          <pic:cNvPr id="9" name="registro de compra por el empleado.png"/>
+                          <pic:cNvPicPr/>
+                        </pic:nvPicPr>
+                        <pic:blipFill>
+                          <a:blip r:embed="rId15">
+                            <a:extLst>
+                              <a:ext uri="{28A0092B-C50C-407E-A947-70E740481C1C}">
+                                <a14:useLocalDpi xmlns:a14="http://schemas.microsoft.com/office/drawing/2010/main" val="0"/>
+                              </a:ext>
+                            </a:extLst>
+                          </a:blip>
+                          <a:stretch>
+                            <a:fillRect/>
+                          </a:stretch>
+                        </pic:blipFill>
+                        <pic:spPr>
+                          <a:xfrm>
+                            <a:off x="0" y="0"/>
+                            <a:ext cx="6371590" cy="4489450"/>
+                          </a:xfrm>
+                          <a:prstGeom prst="rect">
+                            <a:avLst/>
+                          </a:prstGeom>
+                        </pic:spPr>
+                      </pic:pic>
+                    </a:graphicData>
+                  </a:graphic>
+                </wp:inline>
+              </w:drawing>
+            </w:r>
+          </w:p>
+          <w:p>
+            <w:pPr>
+              <w:spacing w:line="240" w:lineRule="auto"/>
+              <w:jc w:val="center"/>
+              <w:rPr>
+                <w:rFonts w:ascii="Calibri" w:eastAsia="Times New Roman" w:hAnsi="Calibri" w:cs="Calibri"/>
+                <w:b w:val="0"/>
+                <w:color w:val="000000"/>
+                <w:sz w:val="22"/>
+                <w:lang w:val="es-CO" w:eastAsia="es-CO"/>
+              </w:rPr>
+            </w:pPr>
+            <w:r>
+              <w:rPr>
+                <w:rFonts w:ascii="Calibri" w:eastAsia="Times New Roman" w:hAnsi="Calibri" w:cs="Calibri"/>
+                <w:b w:val="0"/>
+                <w:color w:val="000000"/>
+                <w:sz w:val="22"/>
+                <w:lang w:val="es-CO" w:eastAsia="es-CO"/>
+              </w:rPr>
+              <w:t>3.registro de compra en el sistema</w:t>
+            </w:r>
+          </w:p>
+          <w:p>
+            <w:pPr>
+              <w:spacing w:line="240" w:lineRule="auto"/>
+              <w:jc w:val="center"/>
+              <w:rPr>
+                <w:rFonts w:ascii="Calibri" w:eastAsia="Times New Roman" w:hAnsi="Calibri" w:cs="Calibri"/>
+                <w:b w:val="0"/>
+                <w:color w:val="000000"/>
+                <w:sz w:val="22"/>
+                <w:lang w:val="es-CO" w:eastAsia="es-CO"/>
+              </w:rPr>
+            </w:pPr>
+            <w:r>
+              <w:rPr>
+                <w:rFonts w:ascii="Calibri" w:eastAsia="Times New Roman" w:hAnsi="Calibri" w:cs="Calibri"/>
+                <w:b w:val="0"/>
+                <w:noProof/>
+                <w:color w:val="000000"/>
+                <w:sz w:val="22"/>
+                <w:lang w:val="es-CO" w:eastAsia="es-CO"/>
+              </w:rPr>
+              <w:lastRenderedPageBreak/>
+              <w:drawing>
+                <wp:inline distT="0" distB="0" distL="0" distR="0" wp14:anchorId="15793C4F" wp14:editId="5AF12A04">
+                  <wp:extent cx="6371590" cy="4493895"/>
+                  <wp:effectExtent l="0" t="0" r="0" b="1905"/>
+                  <wp:docPr id="11" name="Imagen 11"/>
+                  <wp:cNvGraphicFramePr>
+                    <a:graphicFrameLocks xmlns:a="http://schemas.openxmlformats.org/drawingml/2006/main" noChangeAspect="1"/>
+                  </wp:cNvGraphicFramePr>
+                  <a:graphic xmlns:a="http://schemas.openxmlformats.org/drawingml/2006/main">
+                    <a:graphicData uri="http://schemas.openxmlformats.org/drawingml/2006/picture">
+                      <pic:pic xmlns:pic="http://schemas.openxmlformats.org/drawingml/2006/picture">
+                        <pic:nvPicPr>
+                          <pic:cNvPr id="11" name="registro de compra en el sistema.png"/>
+                          <pic:cNvPicPr/>
+                        </pic:nvPicPr>
+                        <pic:blipFill>
+                          <a:blip r:embed="rId16">
+                            <a:extLst>
+                              <a:ext uri="{28A0092B-C50C-407E-A947-70E740481C1C}">
+                                <a14:useLocalDpi xmlns:a14="http://schemas.microsoft.com/office/drawing/2010/main" val="0"/>
+                              </a:ext>
+                            </a:extLst>
+                          </a:blip>
+                          <a:stretch>
+                            <a:fillRect/>
+                          </a:stretch>
+                        </pic:blipFill>
+                        <pic:spPr>
+                          <a:xfrm>
+                            <a:off x="0" y="0"/>
+                            <a:ext cx="6371590" cy="4493895"/>
+                          </a:xfrm>
+                          <a:prstGeom prst="rect">
+                            <a:avLst/>
+                          </a:prstGeom>
+                        </pic:spPr>
+                      </pic:pic>
+                    </a:graphicData>
+                  </a:graphic>
+                </wp:inline>
+              </w:drawing>
+            </w:r>
+          </w:p>
+          <w:p>
+            <w:pPr>
+              <w:spacing w:line="240" w:lineRule="auto"/>
+              <w:jc w:val="center"/>
+              <w:rPr>
+                <w:rFonts w:ascii="Calibri" w:eastAsia="Times New Roman" w:hAnsi="Calibri" w:cs="Calibri"/>
+                <w:b w:val="0"/>
+                <w:color w:val="000000"/>
+                <w:sz w:val="22"/>
+                <w:lang w:val="es-CO" w:eastAsia="es-CO"/>
+              </w:rPr>
+            </w:pPr>
           </w:p>
         </w:tc>
       </w:tr>
@@ -6226,12 +6618,12 @@
         <w:tblLook w:val="04A0" w:firstRow="1" w:lastRow="0" w:firstColumn="1" w:lastColumn="0" w:noHBand="0" w:noVBand="1"/>
       </w:tblPr>
       <w:tblGrid>
-        <w:gridCol w:w="1200"/>
-        <w:gridCol w:w="1200"/>
-        <w:gridCol w:w="1200"/>
-        <w:gridCol w:w="1200"/>
-        <w:gridCol w:w="1200"/>
-        <w:gridCol w:w="1200"/>
+        <w:gridCol w:w="1670"/>
+        <w:gridCol w:w="1670"/>
+        <w:gridCol w:w="1671"/>
+        <w:gridCol w:w="1671"/>
+        <w:gridCol w:w="1671"/>
+        <w:gridCol w:w="1671"/>
       </w:tblGrid>
       <w:tr>
         <w:trPr>
@@ -7313,6 +7705,615 @@
               </w:rPr>
               <w:t> </w:t>
             </w:r>
+            <w:r>
+              <w:rPr>
+                <w:rFonts w:ascii="Calibri" w:eastAsia="Times New Roman" w:hAnsi="Calibri" w:cs="Calibri"/>
+                <w:b w:val="0"/>
+                <w:color w:val="000000"/>
+                <w:sz w:val="22"/>
+                <w:lang w:val="es-CO" w:eastAsia="es-CO"/>
+              </w:rPr>
+              <w:t>4.registro de compra cliente</w:t>
+            </w:r>
+          </w:p>
+          <w:p>
+            <w:pPr>
+              <w:spacing w:line="240" w:lineRule="auto"/>
+              <w:jc w:val="center"/>
+              <w:rPr>
+                <w:rFonts w:ascii="Calibri" w:eastAsia="Times New Roman" w:hAnsi="Calibri" w:cs="Calibri"/>
+                <w:b w:val="0"/>
+                <w:color w:val="000000"/>
+                <w:sz w:val="22"/>
+                <w:lang w:val="es-CO" w:eastAsia="es-CO"/>
+              </w:rPr>
+            </w:pPr>
+            <w:r>
+              <w:rPr>
+                <w:rFonts w:ascii="Calibri" w:eastAsia="Times New Roman" w:hAnsi="Calibri" w:cs="Calibri"/>
+                <w:b w:val="0"/>
+                <w:noProof/>
+                <w:color w:val="000000"/>
+                <w:sz w:val="22"/>
+                <w:lang w:val="es-CO" w:eastAsia="es-CO"/>
+              </w:rPr>
+              <w:lastRenderedPageBreak/>
+              <w:drawing>
+                <wp:inline distT="0" distB="0" distL="0" distR="0" wp14:anchorId="5876E419" wp14:editId="26AB8E22">
+                  <wp:extent cx="6371590" cy="4479290"/>
+                  <wp:effectExtent l="0" t="0" r="0" b="0"/>
+                  <wp:docPr id="12" name="Imagen 12"/>
+                  <wp:cNvGraphicFramePr>
+                    <a:graphicFrameLocks xmlns:a="http://schemas.openxmlformats.org/drawingml/2006/main" noChangeAspect="1"/>
+                  </wp:cNvGraphicFramePr>
+                  <a:graphic xmlns:a="http://schemas.openxmlformats.org/drawingml/2006/main">
+                    <a:graphicData uri="http://schemas.openxmlformats.org/drawingml/2006/picture">
+                      <pic:pic xmlns:pic="http://schemas.openxmlformats.org/drawingml/2006/picture">
+                        <pic:nvPicPr>
+                          <pic:cNvPr id="12" name="registro compra cliente.png"/>
+                          <pic:cNvPicPr/>
+                        </pic:nvPicPr>
+                        <pic:blipFill>
+                          <a:blip r:embed="rId17">
+                            <a:extLst>
+                              <a:ext uri="{28A0092B-C50C-407E-A947-70E740481C1C}">
+                                <a14:useLocalDpi xmlns:a14="http://schemas.microsoft.com/office/drawing/2010/main" val="0"/>
+                              </a:ext>
+                            </a:extLst>
+                          </a:blip>
+                          <a:stretch>
+                            <a:fillRect/>
+                          </a:stretch>
+                        </pic:blipFill>
+                        <pic:spPr>
+                          <a:xfrm>
+                            <a:off x="0" y="0"/>
+                            <a:ext cx="6371590" cy="4479290"/>
+                          </a:xfrm>
+                          <a:prstGeom prst="rect">
+                            <a:avLst/>
+                          </a:prstGeom>
+                        </pic:spPr>
+                      </pic:pic>
+                    </a:graphicData>
+                  </a:graphic>
+                </wp:inline>
+              </w:drawing>
+            </w:r>
+          </w:p>
+          <w:p>
+            <w:pPr>
+              <w:spacing w:line="240" w:lineRule="auto"/>
+              <w:jc w:val="center"/>
+              <w:rPr>
+                <w:rFonts w:ascii="Calibri" w:eastAsia="Times New Roman" w:hAnsi="Calibri" w:cs="Calibri"/>
+                <w:b w:val="0"/>
+                <w:color w:val="000000"/>
+                <w:sz w:val="22"/>
+                <w:lang w:val="es-CO" w:eastAsia="es-CO"/>
+              </w:rPr>
+            </w:pPr>
+            <w:r>
+              <w:rPr>
+                <w:rFonts w:ascii="Calibri" w:eastAsia="Times New Roman" w:hAnsi="Calibri" w:cs="Calibri"/>
+                <w:b w:val="0"/>
+                <w:color w:val="000000"/>
+                <w:sz w:val="22"/>
+                <w:lang w:val="es-CO" w:eastAsia="es-CO"/>
+              </w:rPr>
+              <w:t>5.historial registro de venta cliente</w:t>
+            </w:r>
+          </w:p>
+          <w:p>
+            <w:pPr>
+              <w:spacing w:line="240" w:lineRule="auto"/>
+              <w:jc w:val="center"/>
+              <w:rPr>
+                <w:rFonts w:ascii="Calibri" w:eastAsia="Times New Roman" w:hAnsi="Calibri" w:cs="Calibri"/>
+                <w:b w:val="0"/>
+                <w:color w:val="000000"/>
+                <w:sz w:val="22"/>
+                <w:lang w:val="es-CO" w:eastAsia="es-CO"/>
+              </w:rPr>
+            </w:pPr>
+            <w:r>
+              <w:rPr>
+                <w:rFonts w:ascii="Calibri" w:eastAsia="Times New Roman" w:hAnsi="Calibri" w:cs="Calibri"/>
+                <w:b w:val="0"/>
+                <w:noProof/>
+                <w:color w:val="000000"/>
+                <w:sz w:val="22"/>
+                <w:lang w:val="es-CO" w:eastAsia="es-CO"/>
+              </w:rPr>
+              <w:lastRenderedPageBreak/>
+              <w:drawing>
+                <wp:inline distT="0" distB="0" distL="0" distR="0" wp14:anchorId="17E685F8" wp14:editId="571F208D">
+                  <wp:extent cx="6371590" cy="4459605"/>
+                  <wp:effectExtent l="0" t="0" r="0" b="0"/>
+                  <wp:docPr id="13" name="Imagen 13"/>
+                  <wp:cNvGraphicFramePr>
+                    <a:graphicFrameLocks xmlns:a="http://schemas.openxmlformats.org/drawingml/2006/main" noChangeAspect="1"/>
+                  </wp:cNvGraphicFramePr>
+                  <a:graphic xmlns:a="http://schemas.openxmlformats.org/drawingml/2006/main">
+                    <a:graphicData uri="http://schemas.openxmlformats.org/drawingml/2006/picture">
+                      <pic:pic xmlns:pic="http://schemas.openxmlformats.org/drawingml/2006/picture">
+                        <pic:nvPicPr>
+                          <pic:cNvPr id="13" name="historial registro venta cliente.png"/>
+                          <pic:cNvPicPr/>
+                        </pic:nvPicPr>
+                        <pic:blipFill>
+                          <a:blip r:embed="rId18">
+                            <a:extLst>
+                              <a:ext uri="{28A0092B-C50C-407E-A947-70E740481C1C}">
+                                <a14:useLocalDpi xmlns:a14="http://schemas.microsoft.com/office/drawing/2010/main" val="0"/>
+                              </a:ext>
+                            </a:extLst>
+                          </a:blip>
+                          <a:stretch>
+                            <a:fillRect/>
+                          </a:stretch>
+                        </pic:blipFill>
+                        <pic:spPr>
+                          <a:xfrm>
+                            <a:off x="0" y="0"/>
+                            <a:ext cx="6371590" cy="4459605"/>
+                          </a:xfrm>
+                          <a:prstGeom prst="rect">
+                            <a:avLst/>
+                          </a:prstGeom>
+                        </pic:spPr>
+                      </pic:pic>
+                    </a:graphicData>
+                  </a:graphic>
+                </wp:inline>
+              </w:drawing>
+            </w:r>
+          </w:p>
+          <w:p>
+            <w:pPr>
+              <w:spacing w:line="240" w:lineRule="auto"/>
+              <w:jc w:val="center"/>
+              <w:rPr>
+                <w:rFonts w:ascii="Calibri" w:eastAsia="Times New Roman" w:hAnsi="Calibri" w:cs="Calibri"/>
+                <w:b w:val="0"/>
+                <w:color w:val="000000"/>
+                <w:sz w:val="22"/>
+                <w:lang w:val="es-CO" w:eastAsia="es-CO"/>
+              </w:rPr>
+            </w:pPr>
+            <w:r>
+              <w:rPr>
+                <w:rFonts w:ascii="Calibri" w:eastAsia="Times New Roman" w:hAnsi="Calibri" w:cs="Calibri"/>
+                <w:b w:val="0"/>
+                <w:color w:val="000000"/>
+                <w:sz w:val="22"/>
+                <w:lang w:val="es-CO" w:eastAsia="es-CO"/>
+              </w:rPr>
+              <w:t>6.factura cliente registrado</w:t>
+            </w:r>
+          </w:p>
+          <w:p>
+            <w:pPr>
+              <w:spacing w:line="240" w:lineRule="auto"/>
+              <w:jc w:val="center"/>
+              <w:rPr>
+                <w:rFonts w:ascii="Calibri" w:eastAsia="Times New Roman" w:hAnsi="Calibri" w:cs="Calibri"/>
+                <w:b w:val="0"/>
+                <w:color w:val="000000"/>
+                <w:sz w:val="22"/>
+                <w:lang w:val="es-CO" w:eastAsia="es-CO"/>
+              </w:rPr>
+            </w:pPr>
+            <w:r>
+              <w:rPr>
+                <w:rFonts w:ascii="Calibri" w:eastAsia="Times New Roman" w:hAnsi="Calibri" w:cs="Calibri"/>
+                <w:b w:val="0"/>
+                <w:noProof/>
+                <w:color w:val="000000"/>
+                <w:sz w:val="22"/>
+                <w:lang w:val="es-CO" w:eastAsia="es-CO"/>
+              </w:rPr>
+              <w:lastRenderedPageBreak/>
+              <w:drawing>
+                <wp:inline distT="0" distB="0" distL="0" distR="0" wp14:anchorId="3D24E10D" wp14:editId="089ED0F2">
+                  <wp:extent cx="6371590" cy="4902200"/>
+                  <wp:effectExtent l="0" t="0" r="0" b="0"/>
+                  <wp:docPr id="14" name="Imagen 14"/>
+                  <wp:cNvGraphicFramePr>
+                    <a:graphicFrameLocks xmlns:a="http://schemas.openxmlformats.org/drawingml/2006/main" noChangeAspect="1"/>
+                  </wp:cNvGraphicFramePr>
+                  <a:graphic xmlns:a="http://schemas.openxmlformats.org/drawingml/2006/main">
+                    <a:graphicData uri="http://schemas.openxmlformats.org/drawingml/2006/picture">
+                      <pic:pic xmlns:pic="http://schemas.openxmlformats.org/drawingml/2006/picture">
+                        <pic:nvPicPr>
+                          <pic:cNvPr id="14" name="factura cliente registrado.png"/>
+                          <pic:cNvPicPr/>
+                        </pic:nvPicPr>
+                        <pic:blipFill>
+                          <a:blip r:embed="rId19">
+                            <a:extLst>
+                              <a:ext uri="{28A0092B-C50C-407E-A947-70E740481C1C}">
+                                <a14:useLocalDpi xmlns:a14="http://schemas.microsoft.com/office/drawing/2010/main" val="0"/>
+                              </a:ext>
+                            </a:extLst>
+                          </a:blip>
+                          <a:stretch>
+                            <a:fillRect/>
+                          </a:stretch>
+                        </pic:blipFill>
+                        <pic:spPr>
+                          <a:xfrm>
+                            <a:off x="0" y="0"/>
+                            <a:ext cx="6371590" cy="4902200"/>
+                          </a:xfrm>
+                          <a:prstGeom prst="rect">
+                            <a:avLst/>
+                          </a:prstGeom>
+                        </pic:spPr>
+                      </pic:pic>
+                    </a:graphicData>
+                  </a:graphic>
+                </wp:inline>
+              </w:drawing>
+            </w:r>
+          </w:p>
+          <w:p>
+            <w:pPr>
+              <w:spacing w:line="240" w:lineRule="auto"/>
+              <w:jc w:val="center"/>
+              <w:rPr>
+                <w:rFonts w:ascii="Calibri" w:eastAsia="Times New Roman" w:hAnsi="Calibri" w:cs="Calibri"/>
+                <w:b w:val="0"/>
+                <w:color w:val="000000"/>
+                <w:sz w:val="22"/>
+                <w:lang w:val="es-CO" w:eastAsia="es-CO"/>
+              </w:rPr>
+            </w:pPr>
+          </w:p>
+          <w:p>
+            <w:pPr>
+              <w:spacing w:line="240" w:lineRule="auto"/>
+              <w:jc w:val="center"/>
+              <w:rPr>
+                <w:rFonts w:ascii="Calibri" w:eastAsia="Times New Roman" w:hAnsi="Calibri" w:cs="Calibri"/>
+                <w:b w:val="0"/>
+                <w:color w:val="000000"/>
+                <w:sz w:val="22"/>
+                <w:lang w:val="es-CO" w:eastAsia="es-CO"/>
+              </w:rPr>
+            </w:pPr>
+            <w:r>
+              <w:rPr>
+                <w:rFonts w:ascii="Calibri" w:eastAsia="Times New Roman" w:hAnsi="Calibri" w:cs="Calibri"/>
+                <w:b w:val="0"/>
+                <w:color w:val="000000"/>
+                <w:sz w:val="22"/>
+                <w:lang w:val="es-CO" w:eastAsia="es-CO"/>
+              </w:rPr>
+              <w:t>7</w:t>
+            </w:r>
+            <w:r>
+              <w:rPr>
+                <w:rFonts w:ascii="Calibri" w:eastAsia="Times New Roman" w:hAnsi="Calibri" w:cs="Calibri"/>
+                <w:b w:val="0"/>
+                <w:color w:val="000000"/>
+                <w:sz w:val="22"/>
+                <w:lang w:val="es-CO" w:eastAsia="es-CO"/>
+              </w:rPr>
+              <w:t xml:space="preserve">.registro de compra cliente </w:t>
+            </w:r>
+            <w:r>
+              <w:rPr>
+                <w:rFonts w:ascii="Calibri" w:eastAsia="Times New Roman" w:hAnsi="Calibri" w:cs="Calibri"/>
+                <w:b w:val="0"/>
+                <w:color w:val="000000"/>
+                <w:sz w:val="22"/>
+                <w:lang w:val="es-CO" w:eastAsia="es-CO"/>
+              </w:rPr>
+              <w:t>ocasional</w:t>
+            </w:r>
+          </w:p>
+          <w:p>
+            <w:pPr>
+              <w:spacing w:line="240" w:lineRule="auto"/>
+              <w:jc w:val="center"/>
+              <w:rPr>
+                <w:rFonts w:ascii="Calibri" w:eastAsia="Times New Roman" w:hAnsi="Calibri" w:cs="Calibri"/>
+                <w:b w:val="0"/>
+                <w:color w:val="000000"/>
+                <w:sz w:val="22"/>
+                <w:lang w:val="es-CO" w:eastAsia="es-CO"/>
+              </w:rPr>
+            </w:pPr>
+          </w:p>
+          <w:p>
+            <w:pPr>
+              <w:spacing w:line="240" w:lineRule="auto"/>
+              <w:jc w:val="center"/>
+              <w:rPr>
+                <w:rFonts w:ascii="Calibri" w:eastAsia="Times New Roman" w:hAnsi="Calibri" w:cs="Calibri"/>
+                <w:b w:val="0"/>
+                <w:color w:val="000000"/>
+                <w:sz w:val="22"/>
+                <w:lang w:val="es-CO" w:eastAsia="es-CO"/>
+              </w:rPr>
+            </w:pPr>
+            <w:r>
+              <w:rPr>
+                <w:rFonts w:ascii="Calibri" w:eastAsia="Times New Roman" w:hAnsi="Calibri" w:cs="Calibri"/>
+                <w:b w:val="0"/>
+                <w:noProof/>
+                <w:color w:val="000000"/>
+                <w:sz w:val="22"/>
+                <w:lang w:val="es-CO" w:eastAsia="es-CO"/>
+              </w:rPr>
+              <w:lastRenderedPageBreak/>
+              <w:drawing>
+                <wp:inline distT="0" distB="0" distL="0" distR="0" wp14:anchorId="69B48357" wp14:editId="162FDD40">
+                  <wp:extent cx="6371590" cy="4488180"/>
+                  <wp:effectExtent l="0" t="0" r="0" b="7620"/>
+                  <wp:docPr id="15" name="Imagen 15"/>
+                  <wp:cNvGraphicFramePr>
+                    <a:graphicFrameLocks xmlns:a="http://schemas.openxmlformats.org/drawingml/2006/main" noChangeAspect="1"/>
+                  </wp:cNvGraphicFramePr>
+                  <a:graphic xmlns:a="http://schemas.openxmlformats.org/drawingml/2006/main">
+                    <a:graphicData uri="http://schemas.openxmlformats.org/drawingml/2006/picture">
+                      <pic:pic xmlns:pic="http://schemas.openxmlformats.org/drawingml/2006/picture">
+                        <pic:nvPicPr>
+                          <pic:cNvPr id="15" name="registro venta cliente ocacional.png"/>
+                          <pic:cNvPicPr/>
+                        </pic:nvPicPr>
+                        <pic:blipFill>
+                          <a:blip r:embed="rId20">
+                            <a:extLst>
+                              <a:ext uri="{28A0092B-C50C-407E-A947-70E740481C1C}">
+                                <a14:useLocalDpi xmlns:a14="http://schemas.microsoft.com/office/drawing/2010/main" val="0"/>
+                              </a:ext>
+                            </a:extLst>
+                          </a:blip>
+                          <a:stretch>
+                            <a:fillRect/>
+                          </a:stretch>
+                        </pic:blipFill>
+                        <pic:spPr>
+                          <a:xfrm>
+                            <a:off x="0" y="0"/>
+                            <a:ext cx="6371590" cy="4488180"/>
+                          </a:xfrm>
+                          <a:prstGeom prst="rect">
+                            <a:avLst/>
+                          </a:prstGeom>
+                        </pic:spPr>
+                      </pic:pic>
+                    </a:graphicData>
+                  </a:graphic>
+                </wp:inline>
+              </w:drawing>
+            </w:r>
+          </w:p>
+          <w:p>
+            <w:pPr>
+              <w:spacing w:line="240" w:lineRule="auto"/>
+              <w:jc w:val="center"/>
+              <w:rPr>
+                <w:rFonts w:ascii="Calibri" w:eastAsia="Times New Roman" w:hAnsi="Calibri" w:cs="Calibri"/>
+                <w:b w:val="0"/>
+                <w:color w:val="000000"/>
+                <w:sz w:val="22"/>
+                <w:lang w:val="es-CO" w:eastAsia="es-CO"/>
+              </w:rPr>
+            </w:pPr>
+            <w:r>
+              <w:rPr>
+                <w:rFonts w:ascii="Calibri" w:eastAsia="Times New Roman" w:hAnsi="Calibri" w:cs="Calibri"/>
+                <w:b w:val="0"/>
+                <w:color w:val="000000"/>
+                <w:sz w:val="22"/>
+                <w:lang w:val="es-CO" w:eastAsia="es-CO"/>
+              </w:rPr>
+              <w:t>8</w:t>
+            </w:r>
+            <w:r>
+              <w:rPr>
+                <w:rFonts w:ascii="Calibri" w:eastAsia="Times New Roman" w:hAnsi="Calibri" w:cs="Calibri"/>
+                <w:b w:val="0"/>
+                <w:color w:val="000000"/>
+                <w:sz w:val="22"/>
+                <w:lang w:val="es-CO" w:eastAsia="es-CO"/>
+              </w:rPr>
+              <w:t>. historial registro de venta cliente ocasional</w:t>
+            </w:r>
+          </w:p>
+          <w:p>
+            <w:pPr>
+              <w:spacing w:line="240" w:lineRule="auto"/>
+              <w:jc w:val="center"/>
+              <w:rPr>
+                <w:rFonts w:ascii="Calibri" w:eastAsia="Times New Roman" w:hAnsi="Calibri" w:cs="Calibri"/>
+                <w:b w:val="0"/>
+                <w:color w:val="000000"/>
+                <w:sz w:val="22"/>
+                <w:lang w:val="es-CO" w:eastAsia="es-CO"/>
+              </w:rPr>
+            </w:pPr>
+            <w:r>
+              <w:rPr>
+                <w:rFonts w:ascii="Calibri" w:eastAsia="Times New Roman" w:hAnsi="Calibri" w:cs="Calibri"/>
+                <w:b w:val="0"/>
+                <w:noProof/>
+                <w:color w:val="000000"/>
+                <w:sz w:val="22"/>
+                <w:lang w:val="es-CO" w:eastAsia="es-CO"/>
+              </w:rPr>
+              <w:lastRenderedPageBreak/>
+              <w:drawing>
+                <wp:inline distT="0" distB="0" distL="0" distR="0" wp14:anchorId="6EC4BFF9" wp14:editId="5E649AF8">
+                  <wp:extent cx="6371590" cy="4486275"/>
+                  <wp:effectExtent l="0" t="0" r="0" b="9525"/>
+                  <wp:docPr id="16" name="Imagen 16"/>
+                  <wp:cNvGraphicFramePr>
+                    <a:graphicFrameLocks xmlns:a="http://schemas.openxmlformats.org/drawingml/2006/main" noChangeAspect="1"/>
+                  </wp:cNvGraphicFramePr>
+                  <a:graphic xmlns:a="http://schemas.openxmlformats.org/drawingml/2006/main">
+                    <a:graphicData uri="http://schemas.openxmlformats.org/drawingml/2006/picture">
+                      <pic:pic xmlns:pic="http://schemas.openxmlformats.org/drawingml/2006/picture">
+                        <pic:nvPicPr>
+                          <pic:cNvPr id="16" name="historial venta cliente ocacional.png"/>
+                          <pic:cNvPicPr/>
+                        </pic:nvPicPr>
+                        <pic:blipFill>
+                          <a:blip r:embed="rId21">
+                            <a:extLst>
+                              <a:ext uri="{28A0092B-C50C-407E-A947-70E740481C1C}">
+                                <a14:useLocalDpi xmlns:a14="http://schemas.microsoft.com/office/drawing/2010/main" val="0"/>
+                              </a:ext>
+                            </a:extLst>
+                          </a:blip>
+                          <a:stretch>
+                            <a:fillRect/>
+                          </a:stretch>
+                        </pic:blipFill>
+                        <pic:spPr>
+                          <a:xfrm>
+                            <a:off x="0" y="0"/>
+                            <a:ext cx="6371590" cy="4486275"/>
+                          </a:xfrm>
+                          <a:prstGeom prst="rect">
+                            <a:avLst/>
+                          </a:prstGeom>
+                        </pic:spPr>
+                      </pic:pic>
+                    </a:graphicData>
+                  </a:graphic>
+                </wp:inline>
+              </w:drawing>
+            </w:r>
+          </w:p>
+          <w:p>
+            <w:pPr>
+              <w:spacing w:line="240" w:lineRule="auto"/>
+              <w:jc w:val="center"/>
+              <w:rPr>
+                <w:rFonts w:ascii="Calibri" w:eastAsia="Times New Roman" w:hAnsi="Calibri" w:cs="Calibri"/>
+                <w:b w:val="0"/>
+                <w:color w:val="000000"/>
+                <w:sz w:val="22"/>
+                <w:lang w:val="es-CO" w:eastAsia="es-CO"/>
+              </w:rPr>
+            </w:pPr>
+          </w:p>
+          <w:p>
+            <w:pPr>
+              <w:spacing w:line="240" w:lineRule="auto"/>
+              <w:jc w:val="center"/>
+              <w:rPr>
+                <w:rFonts w:ascii="Calibri" w:eastAsia="Times New Roman" w:hAnsi="Calibri" w:cs="Calibri"/>
+                <w:b w:val="0"/>
+                <w:color w:val="000000"/>
+                <w:sz w:val="22"/>
+                <w:lang w:val="es-CO" w:eastAsia="es-CO"/>
+              </w:rPr>
+            </w:pPr>
+            <w:r>
+              <w:rPr>
+                <w:rFonts w:ascii="Calibri" w:eastAsia="Times New Roman" w:hAnsi="Calibri" w:cs="Calibri"/>
+                <w:b w:val="0"/>
+                <w:color w:val="000000"/>
+                <w:sz w:val="22"/>
+                <w:lang w:val="es-CO" w:eastAsia="es-CO"/>
+              </w:rPr>
+              <w:t>9</w:t>
+            </w:r>
+            <w:r>
+              <w:rPr>
+                <w:rFonts w:ascii="Calibri" w:eastAsia="Times New Roman" w:hAnsi="Calibri" w:cs="Calibri"/>
+                <w:b w:val="0"/>
+                <w:color w:val="000000"/>
+                <w:sz w:val="22"/>
+                <w:lang w:val="es-CO" w:eastAsia="es-CO"/>
+              </w:rPr>
+              <w:t>.factura cliente ocasional</w:t>
+            </w:r>
+          </w:p>
+          <w:p>
+            <w:pPr>
+              <w:spacing w:line="240" w:lineRule="auto"/>
+              <w:jc w:val="center"/>
+              <w:rPr>
+                <w:rFonts w:ascii="Calibri" w:eastAsia="Times New Roman" w:hAnsi="Calibri" w:cs="Calibri"/>
+                <w:b w:val="0"/>
+                <w:color w:val="000000"/>
+                <w:sz w:val="22"/>
+                <w:lang w:val="es-CO" w:eastAsia="es-CO"/>
+              </w:rPr>
+            </w:pPr>
+            <w:bookmarkStart w:id="3" w:name="_GoBack"/>
+            <w:r>
+              <w:rPr>
+                <w:rFonts w:ascii="Calibri" w:eastAsia="Times New Roman" w:hAnsi="Calibri" w:cs="Calibri"/>
+                <w:b w:val="0"/>
+                <w:noProof/>
+                <w:color w:val="000000"/>
+                <w:sz w:val="22"/>
+                <w:lang w:val="es-CO" w:eastAsia="es-CO"/>
+              </w:rPr>
+              <w:lastRenderedPageBreak/>
+              <w:drawing>
+                <wp:inline distT="0" distB="0" distL="0" distR="0" wp14:anchorId="3C0ACAA8" wp14:editId="458DF6B5">
+                  <wp:extent cx="6371590" cy="4920615"/>
+                  <wp:effectExtent l="0" t="0" r="0" b="0"/>
+                  <wp:docPr id="17" name="Imagen 17"/>
+                  <wp:cNvGraphicFramePr>
+                    <a:graphicFrameLocks xmlns:a="http://schemas.openxmlformats.org/drawingml/2006/main" noChangeAspect="1"/>
+                  </wp:cNvGraphicFramePr>
+                  <a:graphic xmlns:a="http://schemas.openxmlformats.org/drawingml/2006/main">
+                    <a:graphicData uri="http://schemas.openxmlformats.org/drawingml/2006/picture">
+                      <pic:pic xmlns:pic="http://schemas.openxmlformats.org/drawingml/2006/picture">
+                        <pic:nvPicPr>
+                          <pic:cNvPr id="17" name="factura cliente ocacional.png"/>
+                          <pic:cNvPicPr/>
+                        </pic:nvPicPr>
+                        <pic:blipFill>
+                          <a:blip r:embed="rId22">
+                            <a:extLst>
+                              <a:ext uri="{28A0092B-C50C-407E-A947-70E740481C1C}">
+                                <a14:useLocalDpi xmlns:a14="http://schemas.microsoft.com/office/drawing/2010/main" val="0"/>
+                              </a:ext>
+                            </a:extLst>
+                          </a:blip>
+                          <a:stretch>
+                            <a:fillRect/>
+                          </a:stretch>
+                        </pic:blipFill>
+                        <pic:spPr>
+                          <a:xfrm>
+                            <a:off x="0" y="0"/>
+                            <a:ext cx="6371590" cy="4920615"/>
+                          </a:xfrm>
+                          <a:prstGeom prst="rect">
+                            <a:avLst/>
+                          </a:prstGeom>
+                        </pic:spPr>
+                      </pic:pic>
+                    </a:graphicData>
+                  </a:graphic>
+                </wp:inline>
+              </w:drawing>
+            </w:r>
+            <w:bookmarkEnd w:id="3"/>
+          </w:p>
+          <w:p>
+            <w:pPr>
+              <w:spacing w:line="240" w:lineRule="auto"/>
+              <w:jc w:val="center"/>
+              <w:rPr>
+                <w:rFonts w:ascii="Calibri" w:eastAsia="Times New Roman" w:hAnsi="Calibri" w:cs="Calibri"/>
+                <w:b w:val="0"/>
+                <w:color w:val="000000"/>
+                <w:sz w:val="22"/>
+                <w:lang w:val="es-CO" w:eastAsia="es-CO"/>
+              </w:rPr>
+            </w:pPr>
           </w:p>
         </w:tc>
       </w:tr>
@@ -7324,6 +8325,7 @@
         </w:tabs>
       </w:pPr>
       <w:r>
+        <w:lastRenderedPageBreak/>
         <w:tab/>
       </w:r>
     </w:p>
@@ -8447,7 +9449,6 @@
         <w:pStyle w:val="Ttulo2"/>
       </w:pPr>
       <w:r>
-        <w:lastRenderedPageBreak/>
         <w:t>Diagrama de clases</w:t>
       </w:r>
     </w:p>
@@ -8457,6 +9458,7 @@
         <w:pStyle w:val="Ttulo2"/>
       </w:pPr>
       <w:r>
+        <w:lastRenderedPageBreak/>
         <w:t>Diagrama de procesos</w:t>
       </w:r>
     </w:p>
@@ -9532,7 +10534,7 @@
 </file>
 
 <file path=word/endnotes.xml><?xml version="1.0" encoding="utf-8"?>
-<w:endnotes xmlns:wpc="http://schemas.microsoft.com/office/word/2010/wordprocessingCanvas" xmlns:cx="http://schemas.microsoft.com/office/drawing/2014/chartex" xmlns:cx1="http://schemas.microsoft.com/office/drawing/2015/9/8/chartex" xmlns:cx2="http://schemas.microsoft.com/office/drawing/2015/10/21/chartex" xmlns:cx3="http://schemas.microsoft.com/office/drawing/2016/5/9/chartex" xmlns:cx4="http://schemas.microsoft.com/office/drawing/2016/5/10/chartex" xmlns:cx5="http://schemas.microsoft.com/office/drawing/2016/5/11/chartex" xmlns:cx6="http://schemas.microsoft.com/office/drawing/2016/5/12/chartex" xmlns:cx7="http://schemas.microsoft.com/office/drawing/2016/5/13/chartex" xmlns:cx8="http://schemas.microsoft.com/office/drawing/2016/5/14/chartex" xmlns:mc="http://schemas.openxmlformats.org/markup-compatibility/2006" xmlns:aink="http://schemas.microsoft.com/office/drawing/2016/ink" xmlns:am3d="http://schemas.microsoft.com/office/drawing/2017/model3d" xmlns:o="urn:schemas-microsoft-com:office:office" xmlns:r="http://schemas.openxmlformats.org/officeDocument/2006/relationships" xmlns:m="http://schemas.openxmlformats.org/officeDocument/2006/math" xmlns:v="urn:schemas-microsoft-com:vml" xmlns:wp14="http://schemas.microsoft.com/office/word/2010/wordprocessingDrawing" xmlns:wp="http://schemas.openxmlformats.org/drawingml/2006/wordprocessingDrawing" xmlns:w10="urn:schemas-microsoft-com:office:word" xmlns:w="http://schemas.openxmlformats.org/wordprocessingml/2006/main" xmlns:w14="http://schemas.microsoft.com/office/word/2010/wordml" xmlns:w15="http://schemas.microsoft.com/office/word/2012/wordml" xmlns:w16cex="http://schemas.microsoft.com/office/word/2018/wordml/cex" xmlns:w16cid="http://schemas.microsoft.com/office/word/2016/wordml/cid" xmlns:w16="http://schemas.microsoft.com/office/word/2018/wordml" xmlns:w16sdtdh="http://schemas.microsoft.com/office/word/2020/wordml/sdtdatahash" xmlns:w16se="http://schemas.microsoft.com/office/word/2015/wordml/symex" xmlns:wpg="http://schemas.microsoft.com/office/word/2010/wordprocessingGroup" xmlns:wpi="http://schemas.microsoft.com/office/word/2010/wordprocessingInk" xmlns:wne="http://schemas.microsoft.com/office/word/2006/wordml" xmlns:wps="http://schemas.microsoft.com/office/word/2010/wordprocessingShape" mc:Ignorable="w14 w15 w16se w16cid w16 w16cex w16sdtdh wp14">
+<w:endnotes xmlns:wpc="http://schemas.microsoft.com/office/word/2010/wordprocessingCanvas" xmlns:cx="http://schemas.microsoft.com/office/drawing/2014/chartex" xmlns:cx1="http://schemas.microsoft.com/office/drawing/2015/9/8/chartex" xmlns:cx2="http://schemas.microsoft.com/office/drawing/2015/10/21/chartex" xmlns:cx3="http://schemas.microsoft.com/office/drawing/2016/5/9/chartex" xmlns:cx4="http://schemas.microsoft.com/office/drawing/2016/5/10/chartex" xmlns:cx5="http://schemas.microsoft.com/office/drawing/2016/5/11/chartex" xmlns:cx6="http://schemas.microsoft.com/office/drawing/2016/5/12/chartex" xmlns:cx7="http://schemas.microsoft.com/office/drawing/2016/5/13/chartex" xmlns:cx8="http://schemas.microsoft.com/office/drawing/2016/5/14/chartex" xmlns:mc="http://schemas.openxmlformats.org/markup-compatibility/2006" xmlns:aink="http://schemas.microsoft.com/office/drawing/2016/ink" xmlns:am3d="http://schemas.microsoft.com/office/drawing/2017/model3d" xmlns:o="urn:schemas-microsoft-com:office:office" xmlns:r="http://schemas.openxmlformats.org/officeDocument/2006/relationships" xmlns:m="http://schemas.openxmlformats.org/officeDocument/2006/math" xmlns:v="urn:schemas-microsoft-com:vml" xmlns:wp14="http://schemas.microsoft.com/office/word/2010/wordprocessingDrawing" xmlns:wp="http://schemas.openxmlformats.org/drawingml/2006/wordprocessingDrawing" xmlns:w10="urn:schemas-microsoft-com:office:word" xmlns:w="http://schemas.openxmlformats.org/wordprocessingml/2006/main" xmlns:w14="http://schemas.microsoft.com/office/word/2010/wordml" xmlns:w15="http://schemas.microsoft.com/office/word/2012/wordml" xmlns:w16cid="http://schemas.microsoft.com/office/word/2016/wordml/cid" xmlns:w16se="http://schemas.microsoft.com/office/word/2015/wordml/symex" xmlns:wpg="http://schemas.microsoft.com/office/word/2010/wordprocessingGroup" xmlns:wpi="http://schemas.microsoft.com/office/word/2010/wordprocessingInk" xmlns:wne="http://schemas.microsoft.com/office/word/2006/wordml" xmlns:wps="http://schemas.microsoft.com/office/word/2010/wordprocessingShape" mc:Ignorable="w14 w15 w16se w16cid wp14">
   <w:endnote w:type="separator" w:id="-1">
     <w:p>
       <w:r>
@@ -9553,7 +10555,7 @@
 </file>
 
 <file path=word/footer1.xml><?xml version="1.0" encoding="utf-8"?>
-<w:ftr xmlns:wpc="http://schemas.microsoft.com/office/word/2010/wordprocessingCanvas" xmlns:cx="http://schemas.microsoft.com/office/drawing/2014/chartex" xmlns:cx1="http://schemas.microsoft.com/office/drawing/2015/9/8/chartex" xmlns:cx2="http://schemas.microsoft.com/office/drawing/2015/10/21/chartex" xmlns:cx3="http://schemas.microsoft.com/office/drawing/2016/5/9/chartex" xmlns:cx4="http://schemas.microsoft.com/office/drawing/2016/5/10/chartex" xmlns:cx5="http://schemas.microsoft.com/office/drawing/2016/5/11/chartex" xmlns:cx6="http://schemas.microsoft.com/office/drawing/2016/5/12/chartex" xmlns:cx7="http://schemas.microsoft.com/office/drawing/2016/5/13/chartex" xmlns:cx8="http://schemas.microsoft.com/office/drawing/2016/5/14/chartex" xmlns:mc="http://schemas.openxmlformats.org/markup-compatibility/2006" xmlns:aink="http://schemas.microsoft.com/office/drawing/2016/ink" xmlns:am3d="http://schemas.microsoft.com/office/drawing/2017/model3d" xmlns:o="urn:schemas-microsoft-com:office:office" xmlns:r="http://schemas.openxmlformats.org/officeDocument/2006/relationships" xmlns:m="http://schemas.openxmlformats.org/officeDocument/2006/math" xmlns:v="urn:schemas-microsoft-com:vml" xmlns:wp14="http://schemas.microsoft.com/office/word/2010/wordprocessingDrawing" xmlns:wp="http://schemas.openxmlformats.org/drawingml/2006/wordprocessingDrawing" xmlns:w10="urn:schemas-microsoft-com:office:word" xmlns:w="http://schemas.openxmlformats.org/wordprocessingml/2006/main" xmlns:w14="http://schemas.microsoft.com/office/word/2010/wordml" xmlns:w15="http://schemas.microsoft.com/office/word/2012/wordml" xmlns:w16cex="http://schemas.microsoft.com/office/word/2018/wordml/cex" xmlns:w16cid="http://schemas.microsoft.com/office/word/2016/wordml/cid" xmlns:w16="http://schemas.microsoft.com/office/word/2018/wordml" xmlns:w16sdtdh="http://schemas.microsoft.com/office/word/2020/wordml/sdtdatahash" xmlns:w16se="http://schemas.microsoft.com/office/word/2015/wordml/symex" xmlns:wpg="http://schemas.microsoft.com/office/word/2010/wordprocessingGroup" xmlns:wpi="http://schemas.microsoft.com/office/word/2010/wordprocessingInk" xmlns:wne="http://schemas.microsoft.com/office/word/2006/wordml" xmlns:wps="http://schemas.microsoft.com/office/word/2010/wordprocessingShape" mc:Ignorable="w14 w15 w16se w16cid w16 w16cex w16sdtdh wp14">
+<w:ftr xmlns:wpc="http://schemas.microsoft.com/office/word/2010/wordprocessingCanvas" xmlns:cx="http://schemas.microsoft.com/office/drawing/2014/chartex" xmlns:cx1="http://schemas.microsoft.com/office/drawing/2015/9/8/chartex" xmlns:cx2="http://schemas.microsoft.com/office/drawing/2015/10/21/chartex" xmlns:cx3="http://schemas.microsoft.com/office/drawing/2016/5/9/chartex" xmlns:cx4="http://schemas.microsoft.com/office/drawing/2016/5/10/chartex" xmlns:cx5="http://schemas.microsoft.com/office/drawing/2016/5/11/chartex" xmlns:cx6="http://schemas.microsoft.com/office/drawing/2016/5/12/chartex" xmlns:cx7="http://schemas.microsoft.com/office/drawing/2016/5/13/chartex" xmlns:cx8="http://schemas.microsoft.com/office/drawing/2016/5/14/chartex" xmlns:mc="http://schemas.openxmlformats.org/markup-compatibility/2006" xmlns:aink="http://schemas.microsoft.com/office/drawing/2016/ink" xmlns:am3d="http://schemas.microsoft.com/office/drawing/2017/model3d" xmlns:o="urn:schemas-microsoft-com:office:office" xmlns:r="http://schemas.openxmlformats.org/officeDocument/2006/relationships" xmlns:m="http://schemas.openxmlformats.org/officeDocument/2006/math" xmlns:v="urn:schemas-microsoft-com:vml" xmlns:wp14="http://schemas.microsoft.com/office/word/2010/wordprocessingDrawing" xmlns:wp="http://schemas.openxmlformats.org/drawingml/2006/wordprocessingDrawing" xmlns:w10="urn:schemas-microsoft-com:office:word" xmlns:w="http://schemas.openxmlformats.org/wordprocessingml/2006/main" xmlns:w14="http://schemas.microsoft.com/office/word/2010/wordml" xmlns:w15="http://schemas.microsoft.com/office/word/2012/wordml" xmlns:w16cid="http://schemas.microsoft.com/office/word/2016/wordml/cid" xmlns:w16se="http://schemas.microsoft.com/office/word/2015/wordml/symex" xmlns:wpg="http://schemas.microsoft.com/office/word/2010/wordprocessingGroup" xmlns:wpi="http://schemas.microsoft.com/office/word/2010/wordprocessingInk" xmlns:wne="http://schemas.microsoft.com/office/word/2006/wordml" xmlns:wps="http://schemas.microsoft.com/office/word/2010/wordprocessingShape" mc:Ignorable="w14 w15 w16se w16cid wp14">
   <w:sdt>
     <w:sdtPr>
       <w:rPr>
@@ -9565,7 +10567,6 @@
         <w:docPartUnique/>
       </w:docPartObj>
     </w:sdtPr>
-    <w:sdtEndPr/>
     <w:sdtContent>
       <w:p>
         <w:pPr>
@@ -9625,7 +10626,7 @@
 </file>
 
 <file path=word/footer2.xml><?xml version="1.0" encoding="utf-8"?>
-<w:ftr xmlns:wpc="http://schemas.microsoft.com/office/word/2010/wordprocessingCanvas" xmlns:cx="http://schemas.microsoft.com/office/drawing/2014/chartex" xmlns:cx1="http://schemas.microsoft.com/office/drawing/2015/9/8/chartex" xmlns:cx2="http://schemas.microsoft.com/office/drawing/2015/10/21/chartex" xmlns:cx3="http://schemas.microsoft.com/office/drawing/2016/5/9/chartex" xmlns:cx4="http://schemas.microsoft.com/office/drawing/2016/5/10/chartex" xmlns:cx5="http://schemas.microsoft.com/office/drawing/2016/5/11/chartex" xmlns:cx6="http://schemas.microsoft.com/office/drawing/2016/5/12/chartex" xmlns:cx7="http://schemas.microsoft.com/office/drawing/2016/5/13/chartex" xmlns:cx8="http://schemas.microsoft.com/office/drawing/2016/5/14/chartex" xmlns:mc="http://schemas.openxmlformats.org/markup-compatibility/2006" xmlns:aink="http://schemas.microsoft.com/office/drawing/2016/ink" xmlns:am3d="http://schemas.microsoft.com/office/drawing/2017/model3d" xmlns:o="urn:schemas-microsoft-com:office:office" xmlns:r="http://schemas.openxmlformats.org/officeDocument/2006/relationships" xmlns:m="http://schemas.openxmlformats.org/officeDocument/2006/math" xmlns:v="urn:schemas-microsoft-com:vml" xmlns:wp14="http://schemas.microsoft.com/office/word/2010/wordprocessingDrawing" xmlns:wp="http://schemas.openxmlformats.org/drawingml/2006/wordprocessingDrawing" xmlns:w10="urn:schemas-microsoft-com:office:word" xmlns:w="http://schemas.openxmlformats.org/wordprocessingml/2006/main" xmlns:w14="http://schemas.microsoft.com/office/word/2010/wordml" xmlns:w15="http://schemas.microsoft.com/office/word/2012/wordml" xmlns:w16cex="http://schemas.microsoft.com/office/word/2018/wordml/cex" xmlns:w16cid="http://schemas.microsoft.com/office/word/2016/wordml/cid" xmlns:w16="http://schemas.microsoft.com/office/word/2018/wordml" xmlns:w16sdtdh="http://schemas.microsoft.com/office/word/2020/wordml/sdtdatahash" xmlns:w16se="http://schemas.microsoft.com/office/word/2015/wordml/symex" xmlns:wpg="http://schemas.microsoft.com/office/word/2010/wordprocessingGroup" xmlns:wpi="http://schemas.microsoft.com/office/word/2010/wordprocessingInk" xmlns:wne="http://schemas.microsoft.com/office/word/2006/wordml" xmlns:wps="http://schemas.microsoft.com/office/word/2010/wordprocessingShape" mc:Ignorable="w14 w15 w16se w16cid w16 w16cex w16sdtdh wp14">
+<w:ftr xmlns:wpc="http://schemas.microsoft.com/office/word/2010/wordprocessingCanvas" xmlns:cx="http://schemas.microsoft.com/office/drawing/2014/chartex" xmlns:cx1="http://schemas.microsoft.com/office/drawing/2015/9/8/chartex" xmlns:cx2="http://schemas.microsoft.com/office/drawing/2015/10/21/chartex" xmlns:cx3="http://schemas.microsoft.com/office/drawing/2016/5/9/chartex" xmlns:cx4="http://schemas.microsoft.com/office/drawing/2016/5/10/chartex" xmlns:cx5="http://schemas.microsoft.com/office/drawing/2016/5/11/chartex" xmlns:cx6="http://schemas.microsoft.com/office/drawing/2016/5/12/chartex" xmlns:cx7="http://schemas.microsoft.com/office/drawing/2016/5/13/chartex" xmlns:cx8="http://schemas.microsoft.com/office/drawing/2016/5/14/chartex" xmlns:mc="http://schemas.openxmlformats.org/markup-compatibility/2006" xmlns:aink="http://schemas.microsoft.com/office/drawing/2016/ink" xmlns:am3d="http://schemas.microsoft.com/office/drawing/2017/model3d" xmlns:o="urn:schemas-microsoft-com:office:office" xmlns:r="http://schemas.openxmlformats.org/officeDocument/2006/relationships" xmlns:m="http://schemas.openxmlformats.org/officeDocument/2006/math" xmlns:v="urn:schemas-microsoft-com:vml" xmlns:wp14="http://schemas.microsoft.com/office/word/2010/wordprocessingDrawing" xmlns:wp="http://schemas.openxmlformats.org/drawingml/2006/wordprocessingDrawing" xmlns:w10="urn:schemas-microsoft-com:office:word" xmlns:w="http://schemas.openxmlformats.org/wordprocessingml/2006/main" xmlns:w14="http://schemas.microsoft.com/office/word/2010/wordml" xmlns:w15="http://schemas.microsoft.com/office/word/2012/wordml" xmlns:w16cid="http://schemas.microsoft.com/office/word/2016/wordml/cid" xmlns:w16se="http://schemas.microsoft.com/office/word/2015/wordml/symex" xmlns:wpg="http://schemas.microsoft.com/office/word/2010/wordprocessingGroup" xmlns:wpi="http://schemas.microsoft.com/office/word/2010/wordprocessingInk" xmlns:wne="http://schemas.microsoft.com/office/word/2006/wordml" xmlns:wps="http://schemas.microsoft.com/office/word/2010/wordprocessingShape" mc:Ignorable="w14 w15 w16se w16cid wp14">
   <w:sdt>
     <w:sdtPr>
       <w:rPr>
@@ -9637,7 +10638,6 @@
         <w:docPartUnique/>
       </w:docPartObj>
     </w:sdtPr>
-    <w:sdtEndPr/>
     <w:sdtContent>
       <w:p>
         <w:pPr>
@@ -9697,7 +10697,7 @@
 </file>
 
 <file path=word/footnotes.xml><?xml version="1.0" encoding="utf-8"?>
-<w:footnotes xmlns:wpc="http://schemas.microsoft.com/office/word/2010/wordprocessingCanvas" xmlns:cx="http://schemas.microsoft.com/office/drawing/2014/chartex" xmlns:cx1="http://schemas.microsoft.com/office/drawing/2015/9/8/chartex" xmlns:cx2="http://schemas.microsoft.com/office/drawing/2015/10/21/chartex" xmlns:cx3="http://schemas.microsoft.com/office/drawing/2016/5/9/chartex" xmlns:cx4="http://schemas.microsoft.com/office/drawing/2016/5/10/chartex" xmlns:cx5="http://schemas.microsoft.com/office/drawing/2016/5/11/chartex" xmlns:cx6="http://schemas.microsoft.com/office/drawing/2016/5/12/chartex" xmlns:cx7="http://schemas.microsoft.com/office/drawing/2016/5/13/chartex" xmlns:cx8="http://schemas.microsoft.com/office/drawing/2016/5/14/chartex" xmlns:mc="http://schemas.openxmlformats.org/markup-compatibility/2006" xmlns:aink="http://schemas.microsoft.com/office/drawing/2016/ink" xmlns:am3d="http://schemas.microsoft.com/office/drawing/2017/model3d" xmlns:o="urn:schemas-microsoft-com:office:office" xmlns:r="http://schemas.openxmlformats.org/officeDocument/2006/relationships" xmlns:m="http://schemas.openxmlformats.org/officeDocument/2006/math" xmlns:v="urn:schemas-microsoft-com:vml" xmlns:wp14="http://schemas.microsoft.com/office/word/2010/wordprocessingDrawing" xmlns:wp="http://schemas.openxmlformats.org/drawingml/2006/wordprocessingDrawing" xmlns:w10="urn:schemas-microsoft-com:office:word" xmlns:w="http://schemas.openxmlformats.org/wordprocessingml/2006/main" xmlns:w14="http://schemas.microsoft.com/office/word/2010/wordml" xmlns:w15="http://schemas.microsoft.com/office/word/2012/wordml" xmlns:w16cex="http://schemas.microsoft.com/office/word/2018/wordml/cex" xmlns:w16cid="http://schemas.microsoft.com/office/word/2016/wordml/cid" xmlns:w16="http://schemas.microsoft.com/office/word/2018/wordml" xmlns:w16sdtdh="http://schemas.microsoft.com/office/word/2020/wordml/sdtdatahash" xmlns:w16se="http://schemas.microsoft.com/office/word/2015/wordml/symex" xmlns:wpg="http://schemas.microsoft.com/office/word/2010/wordprocessingGroup" xmlns:wpi="http://schemas.microsoft.com/office/word/2010/wordprocessingInk" xmlns:wne="http://schemas.microsoft.com/office/word/2006/wordml" xmlns:wps="http://schemas.microsoft.com/office/word/2010/wordprocessingShape" mc:Ignorable="w14 w15 w16se w16cid w16 w16cex w16sdtdh wp14">
+<w:footnotes xmlns:wpc="http://schemas.microsoft.com/office/word/2010/wordprocessingCanvas" xmlns:cx="http://schemas.microsoft.com/office/drawing/2014/chartex" xmlns:cx1="http://schemas.microsoft.com/office/drawing/2015/9/8/chartex" xmlns:cx2="http://schemas.microsoft.com/office/drawing/2015/10/21/chartex" xmlns:cx3="http://schemas.microsoft.com/office/drawing/2016/5/9/chartex" xmlns:cx4="http://schemas.microsoft.com/office/drawing/2016/5/10/chartex" xmlns:cx5="http://schemas.microsoft.com/office/drawing/2016/5/11/chartex" xmlns:cx6="http://schemas.microsoft.com/office/drawing/2016/5/12/chartex" xmlns:cx7="http://schemas.microsoft.com/office/drawing/2016/5/13/chartex" xmlns:cx8="http://schemas.microsoft.com/office/drawing/2016/5/14/chartex" xmlns:mc="http://schemas.openxmlformats.org/markup-compatibility/2006" xmlns:aink="http://schemas.microsoft.com/office/drawing/2016/ink" xmlns:am3d="http://schemas.microsoft.com/office/drawing/2017/model3d" xmlns:o="urn:schemas-microsoft-com:office:office" xmlns:r="http://schemas.openxmlformats.org/officeDocument/2006/relationships" xmlns:m="http://schemas.openxmlformats.org/officeDocument/2006/math" xmlns:v="urn:schemas-microsoft-com:vml" xmlns:wp14="http://schemas.microsoft.com/office/word/2010/wordprocessingDrawing" xmlns:wp="http://schemas.openxmlformats.org/drawingml/2006/wordprocessingDrawing" xmlns:w10="urn:schemas-microsoft-com:office:word" xmlns:w="http://schemas.openxmlformats.org/wordprocessingml/2006/main" xmlns:w14="http://schemas.microsoft.com/office/word/2010/wordml" xmlns:w15="http://schemas.microsoft.com/office/word/2012/wordml" xmlns:w16cid="http://schemas.microsoft.com/office/word/2016/wordml/cid" xmlns:w16se="http://schemas.microsoft.com/office/word/2015/wordml/symex" xmlns:wpg="http://schemas.microsoft.com/office/word/2010/wordprocessingGroup" xmlns:wpi="http://schemas.microsoft.com/office/word/2010/wordprocessingInk" xmlns:wne="http://schemas.microsoft.com/office/word/2006/wordml" xmlns:wps="http://schemas.microsoft.com/office/word/2010/wordprocessingShape" mc:Ignorable="w14 w15 w16se w16cid wp14">
   <w:footnote w:type="separator" w:id="-1">
     <w:p>
       <w:r>
@@ -9718,7 +10718,7 @@
 </file>
 
 <file path=word/header1.xml><?xml version="1.0" encoding="utf-8"?>
-<w:hdr xmlns:wpc="http://schemas.microsoft.com/office/word/2010/wordprocessingCanvas" xmlns:cx="http://schemas.microsoft.com/office/drawing/2014/chartex" xmlns:cx1="http://schemas.microsoft.com/office/drawing/2015/9/8/chartex" xmlns:cx2="http://schemas.microsoft.com/office/drawing/2015/10/21/chartex" xmlns:cx3="http://schemas.microsoft.com/office/drawing/2016/5/9/chartex" xmlns:cx4="http://schemas.microsoft.com/office/drawing/2016/5/10/chartex" xmlns:cx5="http://schemas.microsoft.com/office/drawing/2016/5/11/chartex" xmlns:cx6="http://schemas.microsoft.com/office/drawing/2016/5/12/chartex" xmlns:cx7="http://schemas.microsoft.com/office/drawing/2016/5/13/chartex" xmlns:cx8="http://schemas.microsoft.com/office/drawing/2016/5/14/chartex" xmlns:mc="http://schemas.openxmlformats.org/markup-compatibility/2006" xmlns:aink="http://schemas.microsoft.com/office/drawing/2016/ink" xmlns:am3d="http://schemas.microsoft.com/office/drawing/2017/model3d" xmlns:o="urn:schemas-microsoft-com:office:office" xmlns:r="http://schemas.openxmlformats.org/officeDocument/2006/relationships" xmlns:m="http://schemas.openxmlformats.org/officeDocument/2006/math" xmlns:v="urn:schemas-microsoft-com:vml" xmlns:wp14="http://schemas.microsoft.com/office/word/2010/wordprocessingDrawing" xmlns:wp="http://schemas.openxmlformats.org/drawingml/2006/wordprocessingDrawing" xmlns:w10="urn:schemas-microsoft-com:office:word" xmlns:w="http://schemas.openxmlformats.org/wordprocessingml/2006/main" xmlns:w14="http://schemas.microsoft.com/office/word/2010/wordml" xmlns:w15="http://schemas.microsoft.com/office/word/2012/wordml" xmlns:w16cex="http://schemas.microsoft.com/office/word/2018/wordml/cex" xmlns:w16cid="http://schemas.microsoft.com/office/word/2016/wordml/cid" xmlns:w16="http://schemas.microsoft.com/office/word/2018/wordml" xmlns:w16sdtdh="http://schemas.microsoft.com/office/word/2020/wordml/sdtdatahash" xmlns:w16se="http://schemas.microsoft.com/office/word/2015/wordml/symex" xmlns:wpg="http://schemas.microsoft.com/office/word/2010/wordprocessingGroup" xmlns:wpi="http://schemas.microsoft.com/office/word/2010/wordprocessingInk" xmlns:wne="http://schemas.microsoft.com/office/word/2006/wordml" xmlns:wps="http://schemas.microsoft.com/office/word/2010/wordprocessingShape" mc:Ignorable="w14 w15 w16se w16cid w16 w16cex w16sdtdh wp14">
+<w:hdr xmlns:wpc="http://schemas.microsoft.com/office/word/2010/wordprocessingCanvas" xmlns:cx="http://schemas.microsoft.com/office/drawing/2014/chartex" xmlns:cx1="http://schemas.microsoft.com/office/drawing/2015/9/8/chartex" xmlns:cx2="http://schemas.microsoft.com/office/drawing/2015/10/21/chartex" xmlns:cx3="http://schemas.microsoft.com/office/drawing/2016/5/9/chartex" xmlns:cx4="http://schemas.microsoft.com/office/drawing/2016/5/10/chartex" xmlns:cx5="http://schemas.microsoft.com/office/drawing/2016/5/11/chartex" xmlns:cx6="http://schemas.microsoft.com/office/drawing/2016/5/12/chartex" xmlns:cx7="http://schemas.microsoft.com/office/drawing/2016/5/13/chartex" xmlns:cx8="http://schemas.microsoft.com/office/drawing/2016/5/14/chartex" xmlns:mc="http://schemas.openxmlformats.org/markup-compatibility/2006" xmlns:aink="http://schemas.microsoft.com/office/drawing/2016/ink" xmlns:am3d="http://schemas.microsoft.com/office/drawing/2017/model3d" xmlns:o="urn:schemas-microsoft-com:office:office" xmlns:r="http://schemas.openxmlformats.org/officeDocument/2006/relationships" xmlns:m="http://schemas.openxmlformats.org/officeDocument/2006/math" xmlns:v="urn:schemas-microsoft-com:vml" xmlns:wp14="http://schemas.microsoft.com/office/word/2010/wordprocessingDrawing" xmlns:wp="http://schemas.openxmlformats.org/drawingml/2006/wordprocessingDrawing" xmlns:w10="urn:schemas-microsoft-com:office:word" xmlns:w="http://schemas.openxmlformats.org/wordprocessingml/2006/main" xmlns:w14="http://schemas.microsoft.com/office/word/2010/wordml" xmlns:w15="http://schemas.microsoft.com/office/word/2012/wordml" xmlns:w16cid="http://schemas.microsoft.com/office/word/2016/wordml/cid" xmlns:w16se="http://schemas.microsoft.com/office/word/2015/wordml/symex" xmlns:wpg="http://schemas.microsoft.com/office/word/2010/wordprocessingGroup" xmlns:wpi="http://schemas.microsoft.com/office/word/2010/wordprocessingInk" xmlns:wne="http://schemas.microsoft.com/office/word/2006/wordml" xmlns:wps="http://schemas.microsoft.com/office/word/2010/wordprocessingShape" mc:Ignorable="w14 w15 w16se w16cid wp14">
   <w:tbl>
     <w:tblPr>
       <w:tblW w:w="10035" w:type="dxa"/>
@@ -9772,7 +10772,7 @@
 </file>
 
 <file path=word/header2.xml><?xml version="1.0" encoding="utf-8"?>
-<w:hdr xmlns:wpc="http://schemas.microsoft.com/office/word/2010/wordprocessingCanvas" xmlns:cx="http://schemas.microsoft.com/office/drawing/2014/chartex" xmlns:cx1="http://schemas.microsoft.com/office/drawing/2015/9/8/chartex" xmlns:cx2="http://schemas.microsoft.com/office/drawing/2015/10/21/chartex" xmlns:cx3="http://schemas.microsoft.com/office/drawing/2016/5/9/chartex" xmlns:cx4="http://schemas.microsoft.com/office/drawing/2016/5/10/chartex" xmlns:cx5="http://schemas.microsoft.com/office/drawing/2016/5/11/chartex" xmlns:cx6="http://schemas.microsoft.com/office/drawing/2016/5/12/chartex" xmlns:cx7="http://schemas.microsoft.com/office/drawing/2016/5/13/chartex" xmlns:cx8="http://schemas.microsoft.com/office/drawing/2016/5/14/chartex" xmlns:mc="http://schemas.openxmlformats.org/markup-compatibility/2006" xmlns:aink="http://schemas.microsoft.com/office/drawing/2016/ink" xmlns:am3d="http://schemas.microsoft.com/office/drawing/2017/model3d" xmlns:o="urn:schemas-microsoft-com:office:office" xmlns:r="http://schemas.openxmlformats.org/officeDocument/2006/relationships" xmlns:m="http://schemas.openxmlformats.org/officeDocument/2006/math" xmlns:v="urn:schemas-microsoft-com:vml" xmlns:wp14="http://schemas.microsoft.com/office/word/2010/wordprocessingDrawing" xmlns:wp="http://schemas.openxmlformats.org/drawingml/2006/wordprocessingDrawing" xmlns:w10="urn:schemas-microsoft-com:office:word" xmlns:w="http://schemas.openxmlformats.org/wordprocessingml/2006/main" xmlns:w14="http://schemas.microsoft.com/office/word/2010/wordml" xmlns:w15="http://schemas.microsoft.com/office/word/2012/wordml" xmlns:w16cex="http://schemas.microsoft.com/office/word/2018/wordml/cex" xmlns:w16cid="http://schemas.microsoft.com/office/word/2016/wordml/cid" xmlns:w16="http://schemas.microsoft.com/office/word/2018/wordml" xmlns:w16sdtdh="http://schemas.microsoft.com/office/word/2020/wordml/sdtdatahash" xmlns:w16se="http://schemas.microsoft.com/office/word/2015/wordml/symex" xmlns:wpg="http://schemas.microsoft.com/office/word/2010/wordprocessingGroup" xmlns:wpi="http://schemas.microsoft.com/office/word/2010/wordprocessingInk" xmlns:wne="http://schemas.microsoft.com/office/word/2006/wordml" xmlns:wps="http://schemas.microsoft.com/office/word/2010/wordprocessingShape" mc:Ignorable="w14 w15 w16se w16cid w16 w16cex w16sdtdh wp14">
+<w:hdr xmlns:wpc="http://schemas.microsoft.com/office/word/2010/wordprocessingCanvas" xmlns:cx="http://schemas.microsoft.com/office/drawing/2014/chartex" xmlns:cx1="http://schemas.microsoft.com/office/drawing/2015/9/8/chartex" xmlns:cx2="http://schemas.microsoft.com/office/drawing/2015/10/21/chartex" xmlns:cx3="http://schemas.microsoft.com/office/drawing/2016/5/9/chartex" xmlns:cx4="http://schemas.microsoft.com/office/drawing/2016/5/10/chartex" xmlns:cx5="http://schemas.microsoft.com/office/drawing/2016/5/11/chartex" xmlns:cx6="http://schemas.microsoft.com/office/drawing/2016/5/12/chartex" xmlns:cx7="http://schemas.microsoft.com/office/drawing/2016/5/13/chartex" xmlns:cx8="http://schemas.microsoft.com/office/drawing/2016/5/14/chartex" xmlns:mc="http://schemas.openxmlformats.org/markup-compatibility/2006" xmlns:aink="http://schemas.microsoft.com/office/drawing/2016/ink" xmlns:am3d="http://schemas.microsoft.com/office/drawing/2017/model3d" xmlns:o="urn:schemas-microsoft-com:office:office" xmlns:r="http://schemas.openxmlformats.org/officeDocument/2006/relationships" xmlns:m="http://schemas.openxmlformats.org/officeDocument/2006/math" xmlns:v="urn:schemas-microsoft-com:vml" xmlns:wp14="http://schemas.microsoft.com/office/word/2010/wordprocessingDrawing" xmlns:wp="http://schemas.openxmlformats.org/drawingml/2006/wordprocessingDrawing" xmlns:w10="urn:schemas-microsoft-com:office:word" xmlns:w="http://schemas.openxmlformats.org/wordprocessingml/2006/main" xmlns:w14="http://schemas.microsoft.com/office/word/2010/wordml" xmlns:w15="http://schemas.microsoft.com/office/word/2012/wordml" xmlns:w16cid="http://schemas.microsoft.com/office/word/2016/wordml/cid" xmlns:w16se="http://schemas.microsoft.com/office/word/2015/wordml/symex" xmlns:wpg="http://schemas.microsoft.com/office/word/2010/wordprocessingGroup" xmlns:wpi="http://schemas.microsoft.com/office/word/2010/wordprocessingInk" xmlns:wne="http://schemas.microsoft.com/office/word/2006/wordml" xmlns:wps="http://schemas.microsoft.com/office/word/2010/wordprocessingShape" mc:Ignorable="w14 w15 w16se w16cid wp14">
   <w:tbl>
     <w:tblPr>
       <w:tblW w:w="10035" w:type="dxa"/>
@@ -9826,7 +10826,7 @@
 </file>
 
 <file path=word/numbering.xml><?xml version="1.0" encoding="utf-8"?>
-<w:numbering xmlns:wpc="http://schemas.microsoft.com/office/word/2010/wordprocessingCanvas" xmlns:cx="http://schemas.microsoft.com/office/drawing/2014/chartex" xmlns:cx1="http://schemas.microsoft.com/office/drawing/2015/9/8/chartex" xmlns:cx2="http://schemas.microsoft.com/office/drawing/2015/10/21/chartex" xmlns:cx3="http://schemas.microsoft.com/office/drawing/2016/5/9/chartex" xmlns:cx4="http://schemas.microsoft.com/office/drawing/2016/5/10/chartex" xmlns:cx5="http://schemas.microsoft.com/office/drawing/2016/5/11/chartex" xmlns:cx6="http://schemas.microsoft.com/office/drawing/2016/5/12/chartex" xmlns:cx7="http://schemas.microsoft.com/office/drawing/2016/5/13/chartex" xmlns:cx8="http://schemas.microsoft.com/office/drawing/2016/5/14/chartex" xmlns:mc="http://schemas.openxmlformats.org/markup-compatibility/2006" xmlns:aink="http://schemas.microsoft.com/office/drawing/2016/ink" xmlns:am3d="http://schemas.microsoft.com/office/drawing/2017/model3d" xmlns:o="urn:schemas-microsoft-com:office:office" xmlns:r="http://schemas.openxmlformats.org/officeDocument/2006/relationships" xmlns:m="http://schemas.openxmlformats.org/officeDocument/2006/math" xmlns:v="urn:schemas-microsoft-com:vml" xmlns:wp14="http://schemas.microsoft.com/office/word/2010/wordprocessingDrawing" xmlns:wp="http://schemas.openxmlformats.org/drawingml/2006/wordprocessingDrawing" xmlns:w10="urn:schemas-microsoft-com:office:word" xmlns:w="http://schemas.openxmlformats.org/wordprocessingml/2006/main" xmlns:w14="http://schemas.microsoft.com/office/word/2010/wordml" xmlns:w15="http://schemas.microsoft.com/office/word/2012/wordml" xmlns:w16cex="http://schemas.microsoft.com/office/word/2018/wordml/cex" xmlns:w16cid="http://schemas.microsoft.com/office/word/2016/wordml/cid" xmlns:w16="http://schemas.microsoft.com/office/word/2018/wordml" xmlns:w16sdtdh="http://schemas.microsoft.com/office/word/2020/wordml/sdtdatahash" xmlns:w16se="http://schemas.microsoft.com/office/word/2015/wordml/symex" xmlns:wpg="http://schemas.microsoft.com/office/word/2010/wordprocessingGroup" xmlns:wpi="http://schemas.microsoft.com/office/word/2010/wordprocessingInk" xmlns:wne="http://schemas.microsoft.com/office/word/2006/wordml" xmlns:wps="http://schemas.microsoft.com/office/word/2010/wordprocessingShape" mc:Ignorable="w14 w15 w16se w16cid w16 w16cex w16sdtdh wp14">
+<w:numbering xmlns:wpc="http://schemas.microsoft.com/office/word/2010/wordprocessingCanvas" xmlns:cx="http://schemas.microsoft.com/office/drawing/2014/chartex" xmlns:cx1="http://schemas.microsoft.com/office/drawing/2015/9/8/chartex" xmlns:cx2="http://schemas.microsoft.com/office/drawing/2015/10/21/chartex" xmlns:cx3="http://schemas.microsoft.com/office/drawing/2016/5/9/chartex" xmlns:cx4="http://schemas.microsoft.com/office/drawing/2016/5/10/chartex" xmlns:cx5="http://schemas.microsoft.com/office/drawing/2016/5/11/chartex" xmlns:cx6="http://schemas.microsoft.com/office/drawing/2016/5/12/chartex" xmlns:cx7="http://schemas.microsoft.com/office/drawing/2016/5/13/chartex" xmlns:cx8="http://schemas.microsoft.com/office/drawing/2016/5/14/chartex" xmlns:mc="http://schemas.openxmlformats.org/markup-compatibility/2006" xmlns:aink="http://schemas.microsoft.com/office/drawing/2016/ink" xmlns:am3d="http://schemas.microsoft.com/office/drawing/2017/model3d" xmlns:o="urn:schemas-microsoft-com:office:office" xmlns:r="http://schemas.openxmlformats.org/officeDocument/2006/relationships" xmlns:m="http://schemas.openxmlformats.org/officeDocument/2006/math" xmlns:v="urn:schemas-microsoft-com:vml" xmlns:wp14="http://schemas.microsoft.com/office/word/2010/wordprocessingDrawing" xmlns:wp="http://schemas.openxmlformats.org/drawingml/2006/wordprocessingDrawing" xmlns:w10="urn:schemas-microsoft-com:office:word" xmlns:w="http://schemas.openxmlformats.org/wordprocessingml/2006/main" xmlns:w14="http://schemas.microsoft.com/office/word/2010/wordml" xmlns:w15="http://schemas.microsoft.com/office/word/2012/wordml" xmlns:w16cid="http://schemas.microsoft.com/office/word/2016/wordml/cid" xmlns:w16se="http://schemas.microsoft.com/office/word/2015/wordml/symex" xmlns:wpg="http://schemas.microsoft.com/office/word/2010/wordprocessingGroup" xmlns:wpi="http://schemas.microsoft.com/office/word/2010/wordprocessingInk" xmlns:wne="http://schemas.microsoft.com/office/word/2006/wordml" xmlns:wps="http://schemas.microsoft.com/office/word/2010/wordprocessingShape" mc:Ignorable="w14 w15 w16se w16cid wp14">
   <w:abstractNum w:abstractNumId="0" w15:restartNumberingAfterBreak="0">
     <w:nsid w:val="09152359"/>
     <w:multiLevelType w:val="hybridMultilevel"/>
@@ -13726,7 +14726,7 @@
 </file>
 
 <file path=word/styles.xml><?xml version="1.0" encoding="utf-8"?>
-<w:styles xmlns:mc="http://schemas.openxmlformats.org/markup-compatibility/2006" xmlns:r="http://schemas.openxmlformats.org/officeDocument/2006/relationships" xmlns:w="http://schemas.openxmlformats.org/wordprocessingml/2006/main" xmlns:w14="http://schemas.microsoft.com/office/word/2010/wordml" xmlns:w15="http://schemas.microsoft.com/office/word/2012/wordml" xmlns:w16cex="http://schemas.microsoft.com/office/word/2018/wordml/cex" xmlns:w16cid="http://schemas.microsoft.com/office/word/2016/wordml/cid" xmlns:w16="http://schemas.microsoft.com/office/word/2018/wordml" xmlns:w16sdtdh="http://schemas.microsoft.com/office/word/2020/wordml/sdtdatahash" xmlns:w16se="http://schemas.microsoft.com/office/word/2015/wordml/symex" mc:Ignorable="w14 w15 w16se w16cid w16 w16cex w16sdtdh">
+<w:styles xmlns:mc="http://schemas.openxmlformats.org/markup-compatibility/2006" xmlns:r="http://schemas.openxmlformats.org/officeDocument/2006/relationships" xmlns:w="http://schemas.openxmlformats.org/wordprocessingml/2006/main" xmlns:w14="http://schemas.microsoft.com/office/word/2010/wordml" xmlns:w15="http://schemas.microsoft.com/office/word/2012/wordml" xmlns:w16cid="http://schemas.microsoft.com/office/word/2016/wordml/cid" xmlns:w16se="http://schemas.microsoft.com/office/word/2015/wordml/symex" mc:Ignorable="w14 w15 w16se w16cid">
   <w:docDefaults>
     <w:rPrDefault>
       <w:rPr>
@@ -13742,7 +14742,7 @@
       </w:pPr>
     </w:pPrDefault>
   </w:docDefaults>
-  <w:latentStyles w:defLockedState="0" w:defUIPriority="99" w:defSemiHidden="0" w:defUnhideWhenUsed="0" w:defQFormat="0" w:count="376">
+  <w:latentStyles w:defLockedState="0" w:defUIPriority="99" w:defSemiHidden="0" w:defUnhideWhenUsed="0" w:defQFormat="0" w:count="375">
     <w:lsdException w:name="Normal" w:uiPriority="0" w:qFormat="1"/>
     <w:lsdException w:name="heading 1" w:uiPriority="7" w:qFormat="1"/>
     <w:lsdException w:name="heading 2" w:uiPriority="4" w:qFormat="1"/>
@@ -14118,7 +15118,6 @@
     <w:lsdException w:name="Smart Hyperlink" w:semiHidden="1" w:unhideWhenUsed="1"/>
     <w:lsdException w:name="Hashtag" w:semiHidden="1" w:unhideWhenUsed="1"/>
     <w:lsdException w:name="Unresolved Mention" w:semiHidden="1" w:unhideWhenUsed="1"/>
-    <w:lsdException w:name="Smart Link" w:semiHidden="1" w:unhideWhenUsed="1"/>
   </w:latentStyles>
   <w:style w:type="paragraph" w:default="1" w:styleId="Normal">
     <w:name w:val="Normal"/>
@@ -14689,7 +15688,7 @@
 </file>
 
 <file path=word/glossary/document.xml><?xml version="1.0" encoding="utf-8"?>
-<w:glossaryDocument xmlns:wpc="http://schemas.microsoft.com/office/word/2010/wordprocessingCanvas" xmlns:cx="http://schemas.microsoft.com/office/drawing/2014/chartex" xmlns:cx1="http://schemas.microsoft.com/office/drawing/2015/9/8/chartex" xmlns:cx2="http://schemas.microsoft.com/office/drawing/2015/10/21/chartex" xmlns:cx3="http://schemas.microsoft.com/office/drawing/2016/5/9/chartex" xmlns:cx4="http://schemas.microsoft.com/office/drawing/2016/5/10/chartex" xmlns:cx5="http://schemas.microsoft.com/office/drawing/2016/5/11/chartex" xmlns:cx6="http://schemas.microsoft.com/office/drawing/2016/5/12/chartex" xmlns:cx7="http://schemas.microsoft.com/office/drawing/2016/5/13/chartex" xmlns:cx8="http://schemas.microsoft.com/office/drawing/2016/5/14/chartex" xmlns:mc="http://schemas.openxmlformats.org/markup-compatibility/2006" xmlns:aink="http://schemas.microsoft.com/office/drawing/2016/ink" xmlns:am3d="http://schemas.microsoft.com/office/drawing/2017/model3d" xmlns:o="urn:schemas-microsoft-com:office:office" xmlns:r="http://schemas.openxmlformats.org/officeDocument/2006/relationships" xmlns:m="http://schemas.openxmlformats.org/officeDocument/2006/math" xmlns:v="urn:schemas-microsoft-com:vml" xmlns:wp14="http://schemas.microsoft.com/office/word/2010/wordprocessingDrawing" xmlns:wp="http://schemas.openxmlformats.org/drawingml/2006/wordprocessingDrawing" xmlns:w10="urn:schemas-microsoft-com:office:word" xmlns:w="http://schemas.openxmlformats.org/wordprocessingml/2006/main" xmlns:w14="http://schemas.microsoft.com/office/word/2010/wordml" xmlns:w15="http://schemas.microsoft.com/office/word/2012/wordml" xmlns:w16cex="http://schemas.microsoft.com/office/word/2018/wordml/cex" xmlns:w16cid="http://schemas.microsoft.com/office/word/2016/wordml/cid" xmlns:w16="http://schemas.microsoft.com/office/word/2018/wordml" xmlns:w16sdtdh="http://schemas.microsoft.com/office/word/2020/wordml/sdtdatahash" xmlns:w16se="http://schemas.microsoft.com/office/word/2015/wordml/symex" xmlns:wpg="http://schemas.microsoft.com/office/word/2010/wordprocessingGroup" xmlns:wpi="http://schemas.microsoft.com/office/word/2010/wordprocessingInk" xmlns:wne="http://schemas.microsoft.com/office/word/2006/wordml" xmlns:wps="http://schemas.microsoft.com/office/word/2010/wordprocessingShape" mc:Ignorable="w14 w15 w16se w16cid w16 w16cex w16sdtdh wp14">
+<w:glossaryDocument xmlns:wpc="http://schemas.microsoft.com/office/word/2010/wordprocessingCanvas" xmlns:cx="http://schemas.microsoft.com/office/drawing/2014/chartex" xmlns:cx1="http://schemas.microsoft.com/office/drawing/2015/9/8/chartex" xmlns:cx2="http://schemas.microsoft.com/office/drawing/2015/10/21/chartex" xmlns:cx3="http://schemas.microsoft.com/office/drawing/2016/5/9/chartex" xmlns:cx4="http://schemas.microsoft.com/office/drawing/2016/5/10/chartex" xmlns:cx5="http://schemas.microsoft.com/office/drawing/2016/5/11/chartex" xmlns:cx6="http://schemas.microsoft.com/office/drawing/2016/5/12/chartex" xmlns:cx7="http://schemas.microsoft.com/office/drawing/2016/5/13/chartex" xmlns:cx8="http://schemas.microsoft.com/office/drawing/2016/5/14/chartex" xmlns:mc="http://schemas.openxmlformats.org/markup-compatibility/2006" xmlns:aink="http://schemas.microsoft.com/office/drawing/2016/ink" xmlns:am3d="http://schemas.microsoft.com/office/drawing/2017/model3d" xmlns:o="urn:schemas-microsoft-com:office:office" xmlns:r="http://schemas.openxmlformats.org/officeDocument/2006/relationships" xmlns:m="http://schemas.openxmlformats.org/officeDocument/2006/math" xmlns:v="urn:schemas-microsoft-com:vml" xmlns:wp14="http://schemas.microsoft.com/office/word/2010/wordprocessingDrawing" xmlns:wp="http://schemas.openxmlformats.org/drawingml/2006/wordprocessingDrawing" xmlns:w10="urn:schemas-microsoft-com:office:word" xmlns:w="http://schemas.openxmlformats.org/wordprocessingml/2006/main" xmlns:w14="http://schemas.microsoft.com/office/word/2010/wordml" xmlns:w15="http://schemas.microsoft.com/office/word/2012/wordml" xmlns:w16cid="http://schemas.microsoft.com/office/word/2016/wordml/cid" xmlns:w16se="http://schemas.microsoft.com/office/word/2015/wordml/symex" xmlns:wpg="http://schemas.microsoft.com/office/word/2010/wordprocessingGroup" xmlns:wpi="http://schemas.microsoft.com/office/word/2010/wordprocessingInk" xmlns:wne="http://schemas.microsoft.com/office/word/2006/wordml" xmlns:wps="http://schemas.microsoft.com/office/word/2010/wordprocessingShape" mc:Ignorable="w14 w15 w16se w16cid wp14">
   <w:docParts>
     <w:docPart>
       <w:docPartPr>
@@ -14757,7 +15756,7 @@
 </file>
 
 <file path=word/glossary/fontTable.xml><?xml version="1.0" encoding="utf-8"?>
-<w:fonts xmlns:mc="http://schemas.openxmlformats.org/markup-compatibility/2006" xmlns:r="http://schemas.openxmlformats.org/officeDocument/2006/relationships" xmlns:w="http://schemas.openxmlformats.org/wordprocessingml/2006/main" xmlns:w14="http://schemas.microsoft.com/office/word/2010/wordml" xmlns:w15="http://schemas.microsoft.com/office/word/2012/wordml" xmlns:w16cex="http://schemas.microsoft.com/office/word/2018/wordml/cex" xmlns:w16cid="http://schemas.microsoft.com/office/word/2016/wordml/cid" xmlns:w16="http://schemas.microsoft.com/office/word/2018/wordml" xmlns:w16sdtdh="http://schemas.microsoft.com/office/word/2020/wordml/sdtdatahash" xmlns:w16se="http://schemas.microsoft.com/office/word/2015/wordml/symex" mc:Ignorable="w14 w15 w16se w16cid w16 w16cex w16sdtdh">
+<w:fonts xmlns:mc="http://schemas.openxmlformats.org/markup-compatibility/2006" xmlns:r="http://schemas.openxmlformats.org/officeDocument/2006/relationships" xmlns:w="http://schemas.openxmlformats.org/wordprocessingml/2006/main" xmlns:w14="http://schemas.microsoft.com/office/word/2010/wordml" xmlns:w15="http://schemas.microsoft.com/office/word/2012/wordml" xmlns:w16cid="http://schemas.microsoft.com/office/word/2016/wordml/cid" xmlns:w16se="http://schemas.microsoft.com/office/word/2015/wordml/symex" mc:Ignorable="w14 w15 w16se w16cid">
   <w:font w:name="Calibri">
     <w:panose1 w:val="020F0502020204030204"/>
     <w:charset w:val="00"/>
@@ -14834,7 +15833,7 @@
 </file>
 
 <file path=word/glossary/settings.xml><?xml version="1.0" encoding="utf-8"?>
-<w:settings xmlns:mc="http://schemas.openxmlformats.org/markup-compatibility/2006" xmlns:o="urn:schemas-microsoft-com:office:office" xmlns:r="http://schemas.openxmlformats.org/officeDocument/2006/relationships" xmlns:m="http://schemas.openxmlformats.org/officeDocument/2006/math" xmlns:v="urn:schemas-microsoft-com:vml" xmlns:w10="urn:schemas-microsoft-com:office:word" xmlns:w="http://schemas.openxmlformats.org/wordprocessingml/2006/main" xmlns:w14="http://schemas.microsoft.com/office/word/2010/wordml" xmlns:w15="http://schemas.microsoft.com/office/word/2012/wordml" xmlns:w16cex="http://schemas.microsoft.com/office/word/2018/wordml/cex" xmlns:w16cid="http://schemas.microsoft.com/office/word/2016/wordml/cid" xmlns:w16="http://schemas.microsoft.com/office/word/2018/wordml" xmlns:w16sdtdh="http://schemas.microsoft.com/office/word/2020/wordml/sdtdatahash" xmlns:w16se="http://schemas.microsoft.com/office/word/2015/wordml/symex" xmlns:sl="http://schemas.openxmlformats.org/schemaLibrary/2006/main" mc:Ignorable="w14 w15 w16se w16cid w16 w16cex w16sdtdh">
+<w:settings xmlns:mc="http://schemas.openxmlformats.org/markup-compatibility/2006" xmlns:o="urn:schemas-microsoft-com:office:office" xmlns:r="http://schemas.openxmlformats.org/officeDocument/2006/relationships" xmlns:m="http://schemas.openxmlformats.org/officeDocument/2006/math" xmlns:v="urn:schemas-microsoft-com:vml" xmlns:w10="urn:schemas-microsoft-com:office:word" xmlns:w="http://schemas.openxmlformats.org/wordprocessingml/2006/main" xmlns:w14="http://schemas.microsoft.com/office/word/2010/wordml" xmlns:w15="http://schemas.microsoft.com/office/word/2012/wordml" xmlns:w16cid="http://schemas.microsoft.com/office/word/2016/wordml/cid" xmlns:w16se="http://schemas.microsoft.com/office/word/2015/wordml/symex" xmlns:sl="http://schemas.openxmlformats.org/schemaLibrary/2006/main" mc:Ignorable="w14 w15 w16se w16cid">
   <w:view w:val="normal"/>
   <w:defaultTabStop w:val="708"/>
   <w:hyphenationZone w:val="425"/>
@@ -14850,6 +15849,7 @@
   </w:compat>
   <w:rsids>
     <w:rsidRoot w:val="009B0278"/>
+    <w:rsid w:val="001B06D2"/>
     <w:rsid w:val="001D3D6A"/>
     <w:rsid w:val="00361E76"/>
     <w:rsid w:val="004C570A"/>
@@ -14877,14 +15877,14 @@
   </m:mathPr>
   <w:themeFontLang w:val="es-CO"/>
   <w:clrSchemeMapping w:bg1="light1" w:t1="dark1" w:bg2="light2" w:t2="dark2" w:accent1="accent1" w:accent2="accent2" w:accent3="accent3" w:accent4="accent4" w:accent5="accent5" w:accent6="accent6" w:hyperlink="hyperlink" w:followedHyperlink="followedHyperlink"/>
-  <w:decimalSymbol w:val=","/>
-  <w:listSeparator w:val=";"/>
+  <w:decimalSymbol w:val="."/>
+  <w:listSeparator w:val=","/>
   <w15:chartTrackingRefBased/>
 </w:settings>
 </file>
 
 <file path=word/glossary/styles.xml><?xml version="1.0" encoding="utf-8"?>
-<w:styles xmlns:mc="http://schemas.openxmlformats.org/markup-compatibility/2006" xmlns:r="http://schemas.openxmlformats.org/officeDocument/2006/relationships" xmlns:w="http://schemas.openxmlformats.org/wordprocessingml/2006/main" xmlns:w14="http://schemas.microsoft.com/office/word/2010/wordml" xmlns:w15="http://schemas.microsoft.com/office/word/2012/wordml" xmlns:w16cex="http://schemas.microsoft.com/office/word/2018/wordml/cex" xmlns:w16cid="http://schemas.microsoft.com/office/word/2016/wordml/cid" xmlns:w16="http://schemas.microsoft.com/office/word/2018/wordml" xmlns:w16sdtdh="http://schemas.microsoft.com/office/word/2020/wordml/sdtdatahash" xmlns:w16se="http://schemas.microsoft.com/office/word/2015/wordml/symex" mc:Ignorable="w14 w15 w16se w16cid w16 w16cex w16sdtdh">
+<w:styles xmlns:mc="http://schemas.openxmlformats.org/markup-compatibility/2006" xmlns:r="http://schemas.openxmlformats.org/officeDocument/2006/relationships" xmlns:w="http://schemas.openxmlformats.org/wordprocessingml/2006/main" xmlns:w14="http://schemas.microsoft.com/office/word/2010/wordml" xmlns:w15="http://schemas.microsoft.com/office/word/2012/wordml" xmlns:w16cid="http://schemas.microsoft.com/office/word/2016/wordml/cid" xmlns:w16se="http://schemas.microsoft.com/office/word/2015/wordml/symex" mc:Ignorable="w14 w15 w16se w16cid">
   <w:docDefaults>
     <w:rPrDefault>
       <w:rPr>
@@ -14902,7 +15902,7 @@
       </w:pPr>
     </w:pPrDefault>
   </w:docDefaults>
-  <w:latentStyles w:defLockedState="0" w:defUIPriority="99" w:defSemiHidden="0" w:defUnhideWhenUsed="0" w:defQFormat="0" w:count="376">
+  <w:latentStyles w:defLockedState="0" w:defUIPriority="99" w:defSemiHidden="0" w:defUnhideWhenUsed="0" w:defQFormat="0" w:count="375">
     <w:lsdException w:name="Normal" w:uiPriority="0" w:qFormat="1"/>
     <w:lsdException w:name="heading 1" w:uiPriority="9" w:qFormat="1"/>
     <w:lsdException w:name="heading 2" w:semiHidden="1" w:uiPriority="9" w:unhideWhenUsed="1" w:qFormat="1"/>
@@ -15278,7 +16278,6 @@
     <w:lsdException w:name="Smart Hyperlink" w:semiHidden="1" w:unhideWhenUsed="1"/>
     <w:lsdException w:name="Hashtag" w:semiHidden="1" w:unhideWhenUsed="1"/>
     <w:lsdException w:name="Unresolved Mention" w:semiHidden="1" w:unhideWhenUsed="1"/>
-    <w:lsdException w:name="Smart Link" w:semiHidden="1" w:unhideWhenUsed="1"/>
   </w:latentStyles>
   <w:style w:type="paragraph" w:default="1" w:styleId="Normal">
     <w:name w:val="Normal"/>
@@ -15353,7 +16352,7 @@
 </file>
 
 <file path=word/glossary/webSettings.xml><?xml version="1.0" encoding="utf-8"?>
-<w:webSettings xmlns:mc="http://schemas.openxmlformats.org/markup-compatibility/2006" xmlns:r="http://schemas.openxmlformats.org/officeDocument/2006/relationships" xmlns:w="http://schemas.openxmlformats.org/wordprocessingml/2006/main" xmlns:w14="http://schemas.microsoft.com/office/word/2010/wordml" xmlns:w15="http://schemas.microsoft.com/office/word/2012/wordml" xmlns:w16cex="http://schemas.microsoft.com/office/word/2018/wordml/cex" xmlns:w16cid="http://schemas.microsoft.com/office/word/2016/wordml/cid" xmlns:w16="http://schemas.microsoft.com/office/word/2018/wordml" xmlns:w16sdtdh="http://schemas.microsoft.com/office/word/2020/wordml/sdtdatahash" xmlns:w16se="http://schemas.microsoft.com/office/word/2015/wordml/symex" mc:Ignorable="w14 w15 w16se w16cid w16 w16cex w16sdtdh">
+<w:webSettings xmlns:mc="http://schemas.openxmlformats.org/markup-compatibility/2006" xmlns:r="http://schemas.openxmlformats.org/officeDocument/2006/relationships" xmlns:w="http://schemas.openxmlformats.org/wordprocessingml/2006/main" xmlns:w14="http://schemas.microsoft.com/office/word/2010/wordml" xmlns:w15="http://schemas.microsoft.com/office/word/2012/wordml" xmlns:w16cid="http://schemas.microsoft.com/office/word/2016/wordml/cid" xmlns:w16se="http://schemas.microsoft.com/office/word/2015/wordml/symex" mc:Ignorable="w14 w15 w16se w16cid">
   <w:optimizeForBrowser/>
   <w:allowPNG/>
 </w:webSettings>

</xml_diff>